<commit_message>
docs: add technical paper and compressed presentation video
</commit_message>
<xml_diff>
--- a/Documents/Sprint-2/NotifyEngine-Technical-Paper.docx
+++ b/Documents/Sprint-2/NotifyEngine-Technical-Paper.docx
@@ -35,9 +35,7 @@
         <w:rPr>
           <w:rFonts w:ascii="Times New Roman" w:hAnsi="Times New Roman" w:cs="Times New Roman"/>
           <w:bCs/>
-          <w:i/>
           <w:iCs/>
-          <w:sz w:val="20"/>
           <w:szCs w:val="20"/>
         </w:rPr>
         <w:t>Salvatore Ardisi, Zeeya Ramani, Dhawalshree Mengane, Rhythm Patel, Mohammed Yusif, Krish Dhorajiya</w:t>
@@ -57,9 +55,7 @@
         <w:rPr>
           <w:rFonts w:ascii="Times New Roman" w:hAnsi="Times New Roman" w:cs="Times New Roman"/>
           <w:bCs/>
-          <w:i/>
           <w:iCs/>
-          <w:sz w:val="20"/>
         </w:rPr>
         <w:t>Department of Computer Science, Pace University, New York, USA</w:t>
       </w:r>
@@ -76,7 +72,6 @@
         <w:rPr>
           <w:rFonts w:ascii="Times New Roman" w:hAnsi="Times New Roman" w:cs="Times New Roman"/>
           <w:bCs/>
-          <w:sz w:val="18"/>
         </w:rPr>
         <w:t xml:space="preserve">sa87256p@pace.edu, zr57174@pace.edu, dm01845n@pace.edu, rp31778n@pace.edu, </w:t>
       </w:r>
@@ -84,7 +79,6 @@
         <w:rPr>
           <w:rFonts w:ascii="Times New Roman" w:hAnsi="Times New Roman" w:cs="Times New Roman"/>
           <w:bCs/>
-          <w:sz w:val="18"/>
         </w:rPr>
         <w:t xml:space="preserve">my74768n@pace.edu, </w:t>
       </w:r>
@@ -92,7 +86,6 @@
         <w:rPr>
           <w:rFonts w:ascii="Times New Roman" w:hAnsi="Times New Roman" w:cs="Times New Roman"/>
           <w:bCs/>
-          <w:sz w:val="18"/>
         </w:rPr>
         <w:t>kd77465n@pace.edu</w:t>
       </w:r>
@@ -114,15 +107,6 @@
     </w:p>
     <w:p>
       <w:pPr>
-        <w:rPr>
-          <w:rFonts w:ascii="Times New Roman" w:hAnsi="Times New Roman" w:cs="Times New Roman"/>
-          <w:bCs/>
-          <w:sz w:val="18"/>
-        </w:rPr>
-      </w:pPr>
-    </w:p>
-    <w:p>
-      <w:pPr>
         <w:ind w:firstLine="0"/>
         <w:rPr>
           <w:rFonts w:ascii="Times New Roman" w:hAnsi="Times New Roman" w:cs="Times New Roman"/>
@@ -457,6 +441,7 @@
     </w:p>
     <w:p>
       <w:pPr>
+        <w:jc w:val="both"/>
         <w:rPr>
           <w:rFonts w:ascii="Times New Roman" w:hAnsi="Times New Roman" w:cs="Times New Roman"/>
           <w:bCs/>
@@ -467,7 +452,44 @@
     </w:p>
     <w:p>
       <w:pPr>
-        <w:jc w:val="both"/>
+        <w:ind w:firstLine="0"/>
+        <w:jc w:val="center"/>
+        <w:rPr>
+          <w:rFonts w:ascii="Times New Roman" w:hAnsi="Times New Roman" w:cs="Times New Roman"/>
+          <w:bCs/>
+          <w:sz w:val="20"/>
+          <w:szCs w:val="20"/>
+        </w:rPr>
+      </w:pPr>
+    </w:p>
+    <w:p>
+      <w:pPr>
+        <w:ind w:firstLine="0"/>
+        <w:jc w:val="center"/>
+        <w:rPr>
+          <w:rFonts w:ascii="Times New Roman" w:hAnsi="Times New Roman" w:cs="Times New Roman"/>
+          <w:bCs/>
+          <w:sz w:val="20"/>
+          <w:szCs w:val="20"/>
+        </w:rPr>
+      </w:pPr>
+    </w:p>
+    <w:p>
+      <w:pPr>
+        <w:ind w:firstLine="0"/>
+        <w:jc w:val="center"/>
+        <w:rPr>
+          <w:rFonts w:ascii="Times New Roman" w:hAnsi="Times New Roman" w:cs="Times New Roman"/>
+          <w:bCs/>
+          <w:sz w:val="20"/>
+          <w:szCs w:val="20"/>
+        </w:rPr>
+      </w:pPr>
+    </w:p>
+    <w:p>
+      <w:pPr>
+        <w:ind w:firstLine="0"/>
+        <w:jc w:val="center"/>
         <w:rPr>
           <w:rFonts w:ascii="Times New Roman" w:hAnsi="Times New Roman" w:cs="Times New Roman"/>
           <w:bCs/>
@@ -482,7 +504,8 @@
           <w:sz w:val="20"/>
           <w:szCs w:val="20"/>
         </w:rPr>
-        <w:t xml:space="preserve">II. RELATED WORK </w:t>
+        <w:lastRenderedPageBreak/>
+        <w:t>II. RELATED WORK</w:t>
       </w:r>
     </w:p>
     <w:p>
@@ -502,17 +525,7 @@
           <w:sz w:val="20"/>
           <w:szCs w:val="20"/>
         </w:rPr>
-        <w:t xml:space="preserve">Notification delivery systems have evolved through multiple architectural paradigms. Early systems were predominantly monolithic and rule-driven, relying on fixed </w:t>
-      </w:r>
-      <w:r>
-        <w:rPr>
-          <w:rFonts w:ascii="Times New Roman" w:hAnsi="Times New Roman" w:cs="Times New Roman"/>
-          <w:bCs/>
-          <w:sz w:val="20"/>
-          <w:szCs w:val="20"/>
-        </w:rPr>
-        <w:lastRenderedPageBreak/>
-        <w:t>priority queues and deterministic routing policies. These systems were efficient but lacked personalization capabilities.</w:t>
+        <w:t>Notification delivery systems have evolved through multiple architectural paradigms. Early systems were predominantly monolithic and rule-driven, relying on fixed priority queues and deterministic routing policies. These systems were efficient but lacked personalization capabilities.</w:t>
       </w:r>
     </w:p>
     <w:p>
@@ -626,6 +639,7 @@
     </w:p>
     <w:p>
       <w:pPr>
+        <w:jc w:val="both"/>
         <w:rPr>
           <w:rFonts w:ascii="Times New Roman" w:hAnsi="Times New Roman" w:cs="Times New Roman"/>
           <w:bCs/>
@@ -636,10 +650,12 @@
     </w:p>
     <w:p>
       <w:pPr>
-        <w:ind w:firstLine="0"/>
-        <w:jc w:val="both"/>
-        <w:rPr>
-          <w:rFonts w:ascii="Times New Roman" w:hAnsi="Times New Roman" w:cs="Times New Roman"/>
+        <w:numPr>
+          <w:ilvl w:val="0"/>
+          <w:numId w:val="15"/>
+        </w:numPr>
+        <w:jc w:val="center"/>
+        <w:rPr>
           <w:bCs/>
           <w:sz w:val="20"/>
           <w:szCs w:val="20"/>
@@ -652,12 +668,16 @@
           <w:sz w:val="20"/>
           <w:szCs w:val="20"/>
         </w:rPr>
-        <w:t>III. SYSTEM DESIGN AND METHODOLOGY</w:t>
+        <w:t>SYSTEM ARCHITECTURE</w:t>
       </w:r>
     </w:p>
     <w:p>
       <w:pPr>
-        <w:ind w:firstLine="0"/>
+        <w:pStyle w:val="ListParagraph"/>
+        <w:numPr>
+          <w:ilvl w:val="0"/>
+          <w:numId w:val="28"/>
+        </w:numPr>
         <w:jc w:val="both"/>
         <w:rPr>
           <w:rFonts w:ascii="Times New Roman" w:hAnsi="Times New Roman" w:cs="Times New Roman"/>
@@ -673,21 +693,11 @@
           <w:sz w:val="20"/>
           <w:szCs w:val="20"/>
         </w:rPr>
-        <w:t xml:space="preserve"> </w:t>
-      </w:r>
-      <w:r>
-        <w:rPr>
-          <w:rFonts w:ascii="Times New Roman" w:hAnsi="Times New Roman" w:cs="Times New Roman"/>
-          <w:bCs/>
-          <w:sz w:val="20"/>
-          <w:szCs w:val="20"/>
-        </w:rPr>
-        <w:t>A. System Architecture</w:t>
+        <w:t>Architecture Overview</w:t>
       </w:r>
     </w:p>
     <w:p>
       <w:pPr>
-        <w:mirrorIndents/>
         <w:jc w:val="both"/>
         <w:rPr>
           <w:rFonts w:ascii="Times New Roman" w:hAnsi="Times New Roman" w:cs="Times New Roman"/>
@@ -703,7 +713,7 @@
           <w:sz w:val="20"/>
           <w:szCs w:val="20"/>
         </w:rPr>
-        <w:t xml:space="preserve">NotifyEngine is structured as four services (API server, worker service, ML service, and dashboard) in order to create separation between architecture and engineering decisions. The API accepts inbound notifications using Node.js, Express, and TypeScript based on the validation by the Zod schemas. Once validated it enqueues the messages into the BullMQ priority queues. The API also handles all the REST API interactions, tenant registrations and authenticates the users via their API keys. Finally, it uses Socket.io to connect </w:t>
+        <w:t xml:space="preserve">NotifyEngine is structured as four services (API server, worker service, ML service, and dashboard) </w:t>
       </w:r>
       <w:r>
         <w:rPr>
@@ -712,7 +722,85 @@
           <w:sz w:val="20"/>
           <w:szCs w:val="20"/>
         </w:rPr>
-        <w:t>real-time events and the dashboard. The API server doesn’t deliver the notifications or call the ML services. The creation of this separation of concern is to ensure the API response path has no dependencies on whether or not the downstream services are available.</w:t>
+        <w:t>to</w:t>
+      </w:r>
+      <w:r>
+        <w:rPr>
+          <w:rFonts w:ascii="Times New Roman" w:hAnsi="Times New Roman" w:cs="Times New Roman"/>
+          <w:bCs/>
+          <w:sz w:val="20"/>
+          <w:szCs w:val="20"/>
+        </w:rPr>
+        <w:t xml:space="preserve"> create separation between architecture and engineering decisions. The API accepts inbound notifications using </w:t>
+      </w:r>
+      <w:hyperlink r:id="rId6" w:history="1">
+        <w:r>
+          <w:rPr>
+            <w:rStyle w:val="Hyperlink"/>
+            <w:rFonts w:ascii="Times New Roman" w:hAnsi="Times New Roman" w:cs="Times New Roman"/>
+            <w:bCs/>
+            <w:sz w:val="20"/>
+            <w:szCs w:val="20"/>
+          </w:rPr>
+          <w:t>Node.js</w:t>
+        </w:r>
+      </w:hyperlink>
+      <w:r>
+        <w:rPr>
+          <w:rFonts w:ascii="Times New Roman" w:hAnsi="Times New Roman" w:cs="Times New Roman"/>
+          <w:bCs/>
+          <w:sz w:val="20"/>
+          <w:szCs w:val="20"/>
+        </w:rPr>
+        <w:t xml:space="preserve">, Express, and </w:t>
+      </w:r>
+      <w:r>
+        <w:rPr>
+          <w:rFonts w:ascii="Times New Roman" w:hAnsi="Times New Roman" w:cs="Times New Roman"/>
+          <w:bCs/>
+          <w:sz w:val="20"/>
+          <w:szCs w:val="20"/>
+        </w:rPr>
+        <w:t xml:space="preserve">TypeScript based on the validation by the Zod schemas. Once validated it enqueues the messages into the BullMQ priority queues. The API also handles all the REST API interactions, tenant registrations and authenticates the users via their API keys. Finally, it uses </w:t>
+      </w:r>
+      <w:hyperlink r:id="rId7" w:history="1">
+        <w:r>
+          <w:rPr>
+            <w:rStyle w:val="Hyperlink"/>
+            <w:rFonts w:ascii="Times New Roman" w:hAnsi="Times New Roman" w:cs="Times New Roman"/>
+            <w:bCs/>
+            <w:sz w:val="20"/>
+            <w:szCs w:val="20"/>
+          </w:rPr>
+          <w:t>Socket.io</w:t>
+        </w:r>
+      </w:hyperlink>
+      <w:r>
+        <w:rPr>
+          <w:rFonts w:ascii="Times New Roman" w:hAnsi="Times New Roman" w:cs="Times New Roman"/>
+          <w:bCs/>
+          <w:sz w:val="20"/>
+          <w:szCs w:val="20"/>
+        </w:rPr>
+        <w:t xml:space="preserve"> to connect real-time events and the dashboard. The API server doesn’t deliver the notifications or call the ML services. The creation of this separation of concern is to ensure the API response path has no dependencies on </w:t>
+      </w:r>
+      <w:r>
+        <w:rPr>
+          <w:rFonts w:ascii="Times New Roman" w:hAnsi="Times New Roman" w:cs="Times New Roman"/>
+          <w:bCs/>
+          <w:sz w:val="20"/>
+          <w:szCs w:val="20"/>
+        </w:rPr>
+        <w:t>whether</w:t>
+      </w:r>
+      <w:r>
+        <w:rPr>
+          <w:rFonts w:ascii="Times New Roman" w:hAnsi="Times New Roman" w:cs="Times New Roman"/>
+          <w:bCs/>
+          <w:sz w:val="20"/>
+          <w:szCs w:val="20"/>
+        </w:rPr>
+        <w:t xml:space="preserve"> the downstream services are available.</w:t>
       </w:r>
     </w:p>
     <w:p>
@@ -757,7 +845,10 @@
     </w:p>
     <w:p>
       <w:pPr>
-        <w:ind w:firstLine="0"/>
+        <w:numPr>
+          <w:ilvl w:val="0"/>
+          <w:numId w:val="17"/>
+        </w:numPr>
         <w:jc w:val="both"/>
         <w:rPr>
           <w:rFonts w:ascii="Times New Roman" w:hAnsi="Times New Roman" w:cs="Times New Roman"/>
@@ -773,7 +864,7 @@
           <w:sz w:val="20"/>
           <w:szCs w:val="20"/>
         </w:rPr>
-        <w:t>B. Event-Driven Queue Processing Model</w:t>
+        <w:t>Multi-Tenant Isolation</w:t>
       </w:r>
     </w:p>
     <w:p>
@@ -793,11 +884,33 @@
           <w:sz w:val="20"/>
           <w:szCs w:val="20"/>
         </w:rPr>
-        <w:t>NotifyEngine uses BullMQ as its core distributed queueing system, built on Redis. This enables asynchronous job processing, retry mechanisms, and prioritized execution of notifications. Each notification is treated as a job that transitions through lifecycle states such as waiting, active, completed, and failed.</w:t>
+        <w:t xml:space="preserve">NotifyEngine uses isolation via row-level security (RLS) through PostgreSQL for the multi-tenant application that shares schemas. It uses the same database tables for each </w:t>
+      </w:r>
+      <w:r>
+        <w:rPr>
+          <w:rFonts w:ascii="Times New Roman" w:hAnsi="Times New Roman" w:cs="Times New Roman"/>
+          <w:bCs/>
+          <w:sz w:val="20"/>
+          <w:szCs w:val="20"/>
+        </w:rPr>
+        <w:t>tenant,</w:t>
+      </w:r>
+      <w:r>
+        <w:rPr>
+          <w:rFonts w:ascii="Times New Roman" w:hAnsi="Times New Roman" w:cs="Times New Roman"/>
+          <w:bCs/>
+          <w:sz w:val="20"/>
+          <w:szCs w:val="20"/>
+        </w:rPr>
+        <w:t xml:space="preserve"> but each query is restricted to only the rows where the row matches the current tenant context through RLS policies. The other options to achieve multi-tenancy included schema per tenant which would’ve increased the cost of migration linearly based on the number of tenants and database per tenant which increased the operational overhead.</w:t>
       </w:r>
     </w:p>
     <w:p>
       <w:pPr>
+        <w:numPr>
+          <w:ilvl w:val="0"/>
+          <w:numId w:val="18"/>
+        </w:numPr>
         <w:jc w:val="both"/>
         <w:rPr>
           <w:rFonts w:ascii="Times New Roman" w:hAnsi="Times New Roman" w:cs="Times New Roman"/>
@@ -813,7 +926,7 @@
           <w:sz w:val="20"/>
           <w:szCs w:val="20"/>
         </w:rPr>
-        <w:t>The priority-based queue system ensures that critical notifications (e.g., authentication or system alerts) are processed before bulk or marketing messages. This allows the system to maintain responsiveness under high load conditions.</w:t>
+        <w:t>Notification Processing Pipeline</w:t>
       </w:r>
     </w:p>
     <w:p>
@@ -833,7 +946,17 @@
           <w:sz w:val="20"/>
           <w:szCs w:val="20"/>
         </w:rPr>
-        <w:t>Worker nodes operate independently and consume jobs concurrently, enabling horizontal scaling across multiple instances.</w:t>
+        <w:t xml:space="preserve">The notification life cycle has four states: pending, queues, processing, and either delivered or failed for the final stage. When a POST /v1/notifications is sent, the API server checks the body of the POST request against the Zod schema, adds a new row to the notifications table with a “pending” status enqueues the job into BullMQ based upon priority (critical, high, standard, or bulk) then changes the status to “queued”. After, the API server will send a 202 accepted along with the ID of the new notification. The reason for 202 is that the notification was successfully processed and is expected to </w:t>
+      </w:r>
+      <w:r>
+        <w:rPr>
+          <w:rFonts w:ascii="Times New Roman" w:hAnsi="Times New Roman" w:cs="Times New Roman"/>
+          <w:bCs/>
+          <w:sz w:val="20"/>
+          <w:szCs w:val="20"/>
+        </w:rPr>
+        <w:lastRenderedPageBreak/>
+        <w:t>eventually be sent; there's no guarantee that it will ever be delivered. </w:t>
       </w:r>
     </w:p>
     <w:p>
@@ -846,18 +969,6 @@
           <w:szCs w:val="20"/>
         </w:rPr>
       </w:pPr>
-    </w:p>
-    <w:p>
-      <w:pPr>
-        <w:ind w:firstLine="0"/>
-        <w:jc w:val="both"/>
-        <w:rPr>
-          <w:rFonts w:ascii="Times New Roman" w:hAnsi="Times New Roman" w:cs="Times New Roman"/>
-          <w:bCs/>
-          <w:sz w:val="20"/>
-          <w:szCs w:val="20"/>
-        </w:rPr>
-      </w:pPr>
       <w:r>
         <w:rPr>
           <w:rFonts w:ascii="Times New Roman" w:hAnsi="Times New Roman" w:cs="Times New Roman"/>
@@ -865,7 +976,7 @@
           <w:sz w:val="20"/>
           <w:szCs w:val="20"/>
         </w:rPr>
-        <w:t>C. Multi-Tenant Isolation</w:t>
+        <w:t>The async-acceptance model ensures that the API response time is constrained by the database insert and queue enqueue regardless how long the worker, ML service, or channel providers take to complete the delivery.</w:t>
       </w:r>
     </w:p>
     <w:p>
@@ -885,51 +996,11 @@
           <w:sz w:val="20"/>
           <w:szCs w:val="20"/>
         </w:rPr>
-        <w:t xml:space="preserve">NotifyEngine uses isolation via row-level security (RLS) through PostgreSQL for the multi-tenant application that shares schemas. It uses the same database tables for each </w:t>
-      </w:r>
-      <w:r>
-        <w:rPr>
-          <w:rFonts w:ascii="Times New Roman" w:hAnsi="Times New Roman" w:cs="Times New Roman"/>
-          <w:bCs/>
-          <w:sz w:val="20"/>
-          <w:szCs w:val="20"/>
-        </w:rPr>
-        <w:t>tenant,</w:t>
-      </w:r>
-      <w:r>
-        <w:rPr>
-          <w:rFonts w:ascii="Times New Roman" w:hAnsi="Times New Roman" w:cs="Times New Roman"/>
-          <w:bCs/>
-          <w:sz w:val="20"/>
-          <w:szCs w:val="20"/>
-        </w:rPr>
-        <w:t xml:space="preserve"> but each query is restricted to only the rows where the row matches the current tenant context through RLS policies. The other options to achieve multi-tenancy included schema per tenant which would’ve increased the cost of migration linearly </w:t>
-      </w:r>
-      <w:r>
-        <w:rPr>
-          <w:rFonts w:ascii="Times New Roman" w:hAnsi="Times New Roman" w:cs="Times New Roman"/>
-          <w:bCs/>
-          <w:sz w:val="20"/>
-          <w:szCs w:val="20"/>
-        </w:rPr>
-        <w:lastRenderedPageBreak/>
-        <w:t>based on the number of tenants and database per tenant which increased the operational overhead.</w:t>
+        <w:t>The worker dequeues the job, obtains a database connection, sets the context of the tenant and sets the notification as “processing”. Then the worker loads the notification into memory, creates the routing strategy (static, forced, or adaptive), identifies the delivery channels for the table “channels” based upon if “is_enabled=true” and their circuit state is “closed”, and loads the per-channel recipient from the database table “recipient_channel_stats”.</w:t>
       </w:r>
     </w:p>
     <w:p>
       <w:pPr>
-        <w:ind w:firstLine="0"/>
-        <w:rPr>
-          <w:rFonts w:ascii="Times New Roman" w:hAnsi="Times New Roman" w:cs="Times New Roman"/>
-          <w:bCs/>
-          <w:sz w:val="20"/>
-          <w:szCs w:val="20"/>
-        </w:rPr>
-      </w:pPr>
-    </w:p>
-    <w:p>
-      <w:pPr>
-        <w:ind w:firstLine="0"/>
         <w:jc w:val="both"/>
         <w:rPr>
           <w:rFonts w:ascii="Times New Roman" w:hAnsi="Times New Roman" w:cs="Times New Roman"/>
@@ -945,7 +1016,7 @@
           <w:sz w:val="20"/>
           <w:szCs w:val="20"/>
         </w:rPr>
-        <w:t>D. Notification Processing Pipeline</w:t>
+        <w:t>Next, the worker generates a vector of features for each channel. The channels are ordered according to their defined priorities when using static routing modes. When using adaptive routing, the worker transmits the feature vector for each qualifying channel to the ML service. The ML service provides the probability of engagement for each channel. Based upon these probabilities the worker then promotes the qualifying channel with the greatest predicted engagement probability to the top of its queue (subject to an epsilon-greedy exploration). If the ML service cannot be reached, then the worker uses static routing to determine the order of the qualified channels.</w:t>
       </w:r>
     </w:p>
     <w:p>
@@ -965,11 +1036,15 @@
           <w:sz w:val="20"/>
           <w:szCs w:val="20"/>
         </w:rPr>
-        <w:t>The notification life cycle has four states: pending, queues, processing, and either delivered or failed for the final stage. When a POST /v1/notifications is sent, the API server validates the request using schema validation and persists it into the database with a pending status. The request is then enqueued into BullMQ and marked as queued. The API responds asynchronously with HTTP 202 Accepted.</w:t>
+        <w:t>Finally, the worker iterates through the qualifying channels and attempts to deliver a copy of the message to each one. Upon a successful delivery to a channel the worker creates a “delivery_attempt” record and updates the “recipient_channel_stats” in the database. If there is no qualifying channel, the worker designates the message as “failed” and defers to BullMQ to handle the retries. An idempotency key is in place to prevent multiple deliveries of messages.</w:t>
       </w:r>
     </w:p>
     <w:p>
       <w:pPr>
+        <w:numPr>
+          <w:ilvl w:val="0"/>
+          <w:numId w:val="19"/>
+        </w:numPr>
         <w:jc w:val="both"/>
         <w:rPr>
           <w:rFonts w:ascii="Times New Roman" w:hAnsi="Times New Roman" w:cs="Times New Roman"/>
@@ -985,7 +1060,7 @@
           <w:sz w:val="20"/>
           <w:szCs w:val="20"/>
         </w:rPr>
-        <w:t>Workers process notifications by loading contextual metadata, retrieving eligible channels, and constructing feature vectors for ML inference. If adaptive routing is enabled, predictions are retrieved from the ML service and used to rank channels based on engagement probability.</w:t>
+        <w:t>Database Design</w:t>
       </w:r>
     </w:p>
     <w:p>
@@ -1005,12 +1080,11 @@
           <w:sz w:val="20"/>
           <w:szCs w:val="20"/>
         </w:rPr>
-        <w:t>If no ML service is available, the system falls back to deterministic priority-based routing.</w:t>
+        <w:t>The database schema contains eight tables: tenants, api_keys, channels, notifications, delivery_attempts, receipent_channel_stats, model_metadate, and usage_records.</w:t>
       </w:r>
     </w:p>
     <w:p>
       <w:pPr>
-        <w:ind w:firstLine="0"/>
         <w:jc w:val="both"/>
         <w:rPr>
           <w:rFonts w:ascii="Times New Roman" w:hAnsi="Times New Roman" w:cs="Times New Roman"/>
@@ -1019,18 +1093,6 @@
           <w:szCs w:val="20"/>
         </w:rPr>
       </w:pPr>
-    </w:p>
-    <w:p>
-      <w:pPr>
-        <w:ind w:firstLine="0"/>
-        <w:jc w:val="both"/>
-        <w:rPr>
-          <w:rFonts w:ascii="Times New Roman" w:hAnsi="Times New Roman" w:cs="Times New Roman"/>
-          <w:bCs/>
-          <w:sz w:val="20"/>
-          <w:szCs w:val="20"/>
-        </w:rPr>
-      </w:pPr>
       <w:r>
         <w:rPr>
           <w:rFonts w:ascii="Times New Roman" w:hAnsi="Times New Roman" w:cs="Times New Roman"/>
@@ -1038,11 +1100,25 @@
           <w:sz w:val="20"/>
           <w:szCs w:val="20"/>
         </w:rPr>
-        <w:t>E. Database Design</w:t>
+        <w:t xml:space="preserve">All primary keys are UUID’s generated by “gen_random_uuid()”. The notifications table stores the routing decisions as a JSONB column and captures the “routing_mode”, “channel_selected”, “reason_for_selection”, “did_exploration_occur”, and “model_version”. The delivery attempts table stores JSONB “feature_vector” that's used at the </w:t>
+      </w:r>
+      <w:r>
+        <w:rPr>
+          <w:rFonts w:ascii="Times New Roman" w:hAnsi="Times New Roman" w:cs="Times New Roman"/>
+          <w:bCs/>
+          <w:sz w:val="20"/>
+          <w:szCs w:val="20"/>
+        </w:rPr>
+        <w:t>time of routing; this ensures that when the models are retrained that they have the same features as were used during predictive modeling. The recipient channel stats table is used to maintain the rolling aggregate values for each tenant, recipient, and channel_type. It utilizes ON CONFLICT DO UPDATE upsert pattern. JSONB is used for semi-structured data thats varied across use cases. The PostgreSQL CHECK enforces enum-like validation on the status and type columns.</w:t>
       </w:r>
     </w:p>
     <w:p>
       <w:pPr>
+        <w:numPr>
+          <w:ilvl w:val="0"/>
+          <w:numId w:val="20"/>
+        </w:numPr>
+        <w:jc w:val="both"/>
         <w:rPr>
           <w:rFonts w:ascii="Times New Roman" w:hAnsi="Times New Roman" w:cs="Times New Roman"/>
           <w:bCs/>
@@ -1057,52 +1133,7 @@
           <w:sz w:val="20"/>
           <w:szCs w:val="20"/>
         </w:rPr>
-        <w:t xml:space="preserve">The database schema consists of tenants, </w:t>
-      </w:r>
-      <w:r>
-        <w:rPr>
-          <w:rFonts w:ascii="Times New Roman" w:hAnsi="Times New Roman" w:cs="Times New Roman"/>
-          <w:bCs/>
-          <w:sz w:val="20"/>
-          <w:szCs w:val="20"/>
-        </w:rPr>
-        <w:t>api_</w:t>
-      </w:r>
-      <w:r>
-        <w:rPr>
-          <w:rFonts w:ascii="Times New Roman" w:hAnsi="Times New Roman" w:cs="Times New Roman"/>
-          <w:bCs/>
-          <w:sz w:val="20"/>
-          <w:szCs w:val="20"/>
-        </w:rPr>
-        <w:t>keys</w:t>
-      </w:r>
-      <w:r>
-        <w:rPr>
-          <w:rFonts w:ascii="Times New Roman" w:hAnsi="Times New Roman" w:cs="Times New Roman"/>
-          <w:bCs/>
-          <w:sz w:val="20"/>
-          <w:szCs w:val="20"/>
-        </w:rPr>
-        <w:t>, channels,</w:t>
-      </w:r>
-      <w:r>
-        <w:rPr>
-          <w:rFonts w:ascii="Times New Roman" w:hAnsi="Times New Roman" w:cs="Times New Roman"/>
-          <w:bCs/>
-          <w:sz w:val="20"/>
-          <w:szCs w:val="20"/>
-        </w:rPr>
-        <w:t xml:space="preserve"> </w:t>
-      </w:r>
-      <w:r>
-        <w:rPr>
-          <w:rFonts w:ascii="Times New Roman" w:hAnsi="Times New Roman" w:cs="Times New Roman"/>
-          <w:bCs/>
-          <w:sz w:val="20"/>
-          <w:szCs w:val="20"/>
-        </w:rPr>
-        <w:t>notifications, delivery_attempts, recipient_channel_stats, model_metadata, and usage_records.</w:t>
+        <w:t>API Design</w:t>
       </w:r>
     </w:p>
     <w:p>
@@ -1122,11 +1153,52 @@
           <w:sz w:val="20"/>
           <w:szCs w:val="20"/>
         </w:rPr>
-        <w:t>UUIDs are used as primary keys for distributed consistency. JSONB fields store flexible routing metadata including model predictions, feature vectors, and routing decisions. The recipient_channel_stats table maintains rolling aggregates of engagement metrics per user-channel pair.</w:t>
+        <w:t xml:space="preserve">The API is a RESTful design using a versioned path as a prefix (e.g. /v1/) for each of its implemented endpoints: </w:t>
+      </w:r>
+      <w:r>
+        <w:rPr>
+          <w:rFonts w:ascii="Times New Roman" w:hAnsi="Times New Roman" w:cs="Times New Roman"/>
+          <w:bCs/>
+          <w:sz w:val="20"/>
+          <w:szCs w:val="20"/>
+        </w:rPr>
+        <w:br/>
+        <w:t xml:space="preserve">POST/v1/tenants/register, </w:t>
+      </w:r>
+      <w:r>
+        <w:rPr>
+          <w:rFonts w:ascii="Times New Roman" w:hAnsi="Times New Roman" w:cs="Times New Roman"/>
+          <w:bCs/>
+          <w:sz w:val="20"/>
+          <w:szCs w:val="20"/>
+        </w:rPr>
+        <w:br/>
+        <w:t xml:space="preserve">POST/v1/notifications, </w:t>
+      </w:r>
+      <w:r>
+        <w:rPr>
+          <w:rFonts w:ascii="Times New Roman" w:hAnsi="Times New Roman" w:cs="Times New Roman"/>
+          <w:bCs/>
+          <w:sz w:val="20"/>
+          <w:szCs w:val="20"/>
+        </w:rPr>
+        <w:br/>
+        <w:t xml:space="preserve">GET/v1/notifications/:id, </w:t>
+      </w:r>
+      <w:r>
+        <w:rPr>
+          <w:rFonts w:ascii="Times New Roman" w:hAnsi="Times New Roman" w:cs="Times New Roman"/>
+          <w:bCs/>
+          <w:sz w:val="20"/>
+          <w:szCs w:val="20"/>
+        </w:rPr>
+        <w:br/>
+        <w:t>GET /v1/notifications, </w:t>
       </w:r>
     </w:p>
     <w:p>
       <w:pPr>
+        <w:ind w:firstLine="0"/>
         <w:jc w:val="both"/>
         <w:rPr>
           <w:rFonts w:ascii="Times New Roman" w:hAnsi="Times New Roman" w:cs="Times New Roman"/>
@@ -1142,12 +1214,31 @@
           <w:sz w:val="20"/>
           <w:szCs w:val="20"/>
         </w:rPr>
-        <w:t>Indexes on tenant_id and notification_id ensure efficient query performance under high throughput workloads.</w:t>
+        <w:t xml:space="preserve">GET/v1/notifications/summary, </w:t>
+      </w:r>
+      <w:r>
+        <w:rPr>
+          <w:rFonts w:ascii="Times New Roman" w:hAnsi="Times New Roman" w:cs="Times New Roman"/>
+          <w:bCs/>
+          <w:sz w:val="20"/>
+          <w:szCs w:val="20"/>
+        </w:rPr>
+        <w:br/>
+        <w:t xml:space="preserve">GET/v1/engagement/track,and </w:t>
+      </w:r>
+      <w:r>
+        <w:rPr>
+          <w:rFonts w:ascii="Times New Roman" w:hAnsi="Times New Roman" w:cs="Times New Roman"/>
+          <w:bCs/>
+          <w:sz w:val="20"/>
+          <w:szCs w:val="20"/>
+        </w:rPr>
+        <w:br/>
+        <w:t>GET /health.</w:t>
       </w:r>
     </w:p>
     <w:p>
       <w:pPr>
-        <w:ind w:firstLine="0"/>
         <w:jc w:val="both"/>
         <w:rPr>
           <w:rFonts w:ascii="Times New Roman" w:hAnsi="Times New Roman" w:cs="Times New Roman"/>
@@ -1156,18 +1247,6 @@
           <w:szCs w:val="20"/>
         </w:rPr>
       </w:pPr>
-    </w:p>
-    <w:p>
-      <w:pPr>
-        <w:ind w:firstLine="0"/>
-        <w:jc w:val="both"/>
-        <w:rPr>
-          <w:rFonts w:ascii="Times New Roman" w:hAnsi="Times New Roman" w:cs="Times New Roman"/>
-          <w:bCs/>
-          <w:sz w:val="20"/>
-          <w:szCs w:val="20"/>
-        </w:rPr>
-      </w:pPr>
       <w:r>
         <w:rPr>
           <w:rFonts w:ascii="Times New Roman" w:hAnsi="Times New Roman" w:cs="Times New Roman"/>
@@ -1175,7 +1254,7 @@
           <w:sz w:val="20"/>
           <w:szCs w:val="20"/>
         </w:rPr>
-        <w:t>F. API Design</w:t>
+        <w:t>We use forward compatibility so that the existing integrations on v1 will keep working and any future API changes will live on v2, v3,...,v(n+1). All API requests are validated by schema validation (Zod) in a middleware layer. API keys are used for all authentications.</w:t>
       </w:r>
     </w:p>
     <w:p>
@@ -1188,6 +1267,21 @@
           <w:szCs w:val="20"/>
         </w:rPr>
       </w:pPr>
+    </w:p>
+    <w:p>
+      <w:pPr>
+        <w:numPr>
+          <w:ilvl w:val="0"/>
+          <w:numId w:val="21"/>
+        </w:numPr>
+        <w:jc w:val="center"/>
+        <w:rPr>
+          <w:rFonts w:ascii="Times New Roman" w:hAnsi="Times New Roman" w:cs="Times New Roman"/>
+          <w:bCs/>
+          <w:sz w:val="20"/>
+          <w:szCs w:val="20"/>
+        </w:rPr>
+      </w:pPr>
       <w:r>
         <w:rPr>
           <w:rFonts w:ascii="Times New Roman" w:hAnsi="Times New Roman" w:cs="Times New Roman"/>
@@ -1195,186 +1289,15 @@
           <w:sz w:val="20"/>
           <w:szCs w:val="20"/>
         </w:rPr>
-        <w:t>The API follows a versioned REST architecture using /v1 endpoints. Core endpoints include:</w:t>
+        <w:t>ML Pipeline</w:t>
       </w:r>
     </w:p>
     <w:p>
       <w:pPr>
-        <w:numPr>
-          <w:ilvl w:val="0"/>
-          <w:numId w:val="12"/>
-        </w:numPr>
-        <w:jc w:val="both"/>
-        <w:rPr>
-          <w:rFonts w:ascii="Times New Roman" w:hAnsi="Times New Roman" w:cs="Times New Roman"/>
-          <w:bCs/>
-          <w:sz w:val="20"/>
-          <w:szCs w:val="20"/>
-        </w:rPr>
-      </w:pPr>
-      <w:r>
-        <w:rPr>
-          <w:rFonts w:ascii="Times New Roman" w:hAnsi="Times New Roman" w:cs="Times New Roman"/>
-          <w:bCs/>
-          <w:sz w:val="20"/>
-          <w:szCs w:val="20"/>
-        </w:rPr>
-        <w:t xml:space="preserve">Tenant registration </w:t>
-      </w:r>
-    </w:p>
-    <w:p>
-      <w:pPr>
-        <w:numPr>
-          <w:ilvl w:val="0"/>
-          <w:numId w:val="12"/>
-        </w:numPr>
-        <w:jc w:val="both"/>
-        <w:rPr>
-          <w:rFonts w:ascii="Times New Roman" w:hAnsi="Times New Roman" w:cs="Times New Roman"/>
-          <w:bCs/>
-          <w:sz w:val="20"/>
-          <w:szCs w:val="20"/>
-        </w:rPr>
-      </w:pPr>
-      <w:r>
-        <w:rPr>
-          <w:rFonts w:ascii="Times New Roman" w:hAnsi="Times New Roman" w:cs="Times New Roman"/>
-          <w:bCs/>
-          <w:sz w:val="20"/>
-          <w:szCs w:val="20"/>
-        </w:rPr>
-        <w:t xml:space="preserve">Notification creation </w:t>
-      </w:r>
-    </w:p>
-    <w:p>
-      <w:pPr>
-        <w:numPr>
-          <w:ilvl w:val="0"/>
-          <w:numId w:val="12"/>
-        </w:numPr>
-        <w:jc w:val="both"/>
-        <w:rPr>
-          <w:rFonts w:ascii="Times New Roman" w:hAnsi="Times New Roman" w:cs="Times New Roman"/>
-          <w:bCs/>
-          <w:sz w:val="20"/>
-          <w:szCs w:val="20"/>
-        </w:rPr>
-      </w:pPr>
-      <w:r>
-        <w:rPr>
-          <w:rFonts w:ascii="Times New Roman" w:hAnsi="Times New Roman" w:cs="Times New Roman"/>
-          <w:bCs/>
-          <w:sz w:val="20"/>
-          <w:szCs w:val="20"/>
-        </w:rPr>
-        <w:t xml:space="preserve">Notification retrieval </w:t>
-      </w:r>
-    </w:p>
-    <w:p>
-      <w:pPr>
-        <w:numPr>
-          <w:ilvl w:val="0"/>
-          <w:numId w:val="12"/>
-        </w:numPr>
-        <w:jc w:val="both"/>
-        <w:rPr>
-          <w:rFonts w:ascii="Times New Roman" w:hAnsi="Times New Roman" w:cs="Times New Roman"/>
-          <w:bCs/>
-          <w:sz w:val="20"/>
-          <w:szCs w:val="20"/>
-        </w:rPr>
-      </w:pPr>
-      <w:r>
-        <w:rPr>
-          <w:rFonts w:ascii="Times New Roman" w:hAnsi="Times New Roman" w:cs="Times New Roman"/>
-          <w:bCs/>
-          <w:sz w:val="20"/>
-          <w:szCs w:val="20"/>
-        </w:rPr>
-        <w:t xml:space="preserve">Engagement tracking </w:t>
-      </w:r>
-    </w:p>
-    <w:p>
-      <w:pPr>
-        <w:numPr>
-          <w:ilvl w:val="0"/>
-          <w:numId w:val="12"/>
-        </w:numPr>
-        <w:jc w:val="both"/>
-        <w:rPr>
-          <w:rFonts w:ascii="Times New Roman" w:hAnsi="Times New Roman" w:cs="Times New Roman"/>
-          <w:bCs/>
-          <w:sz w:val="20"/>
-          <w:szCs w:val="20"/>
-        </w:rPr>
-      </w:pPr>
-      <w:r>
-        <w:rPr>
-          <w:rFonts w:ascii="Times New Roman" w:hAnsi="Times New Roman" w:cs="Times New Roman"/>
-          <w:bCs/>
-          <w:sz w:val="20"/>
-          <w:szCs w:val="20"/>
-        </w:rPr>
-        <w:t xml:space="preserve">System health monitoring </w:t>
-      </w:r>
-    </w:p>
-    <w:p>
-      <w:pPr>
-        <w:jc w:val="both"/>
-        <w:rPr>
-          <w:rFonts w:ascii="Times New Roman" w:hAnsi="Times New Roman" w:cs="Times New Roman"/>
-          <w:bCs/>
-          <w:sz w:val="20"/>
-          <w:szCs w:val="20"/>
-        </w:rPr>
-      </w:pPr>
-      <w:r>
-        <w:rPr>
-          <w:rFonts w:ascii="Times New Roman" w:hAnsi="Times New Roman" w:cs="Times New Roman"/>
-          <w:bCs/>
-          <w:sz w:val="20"/>
-          <w:szCs w:val="20"/>
-        </w:rPr>
-        <w:t>Authentication is handled via API keys, ensuring secure multi-tenant isolation. Schema validation ensures strong typing and request correctness.</w:t>
-      </w:r>
-    </w:p>
-    <w:p>
-      <w:pPr>
-        <w:ind w:firstLine="0"/>
-        <w:rPr>
-          <w:rFonts w:ascii="Times New Roman" w:hAnsi="Times New Roman" w:cs="Times New Roman"/>
-          <w:bCs/>
-          <w:sz w:val="20"/>
-          <w:szCs w:val="20"/>
-        </w:rPr>
-      </w:pPr>
-    </w:p>
-    <w:p>
-      <w:pPr>
-        <w:ind w:firstLine="0"/>
-        <w:rPr>
-          <w:rFonts w:ascii="Times New Roman" w:hAnsi="Times New Roman" w:cs="Times New Roman"/>
-          <w:bCs/>
-          <w:sz w:val="20"/>
-          <w:szCs w:val="20"/>
-        </w:rPr>
-      </w:pPr>
-      <w:r>
-        <w:rPr>
-          <w:rFonts w:ascii="Times New Roman" w:hAnsi="Times New Roman" w:cs="Times New Roman"/>
-          <w:bCs/>
-          <w:sz w:val="20"/>
-          <w:szCs w:val="20"/>
-        </w:rPr>
-        <w:t>IV. MACHINE LEARNING PIPELINE</w:t>
-      </w:r>
-    </w:p>
-    <w:p>
-      <w:pPr>
         <w:pStyle w:val="ListParagraph"/>
         <w:numPr>
           <w:ilvl w:val="0"/>
-          <w:numId w:val="14"/>
+          <w:numId w:val="29"/>
         </w:numPr>
         <w:jc w:val="both"/>
         <w:rPr>
@@ -1411,15 +1334,14 @@
           <w:sz w:val="20"/>
           <w:szCs w:val="20"/>
         </w:rPr>
-        <w:t>The ML pipeline is what defines the channel choice. Given an individual, a potential communication channel, and the data associated with this individual, the ML determines the probability of receiving a response from that individual to the message delivered via that selected channel.</w:t>
+        <w:t>The ML pipeline is what defines the channel choice. Given an individual, a potential communication channel, and the data associated with this individual, the ML determines the probability of receiving a response from that individual to the message delivered via that selected channel. Each candidate channel receives an independent probability value which can be used at runtime to select the best candidate channel using the exploration strategy. A multi-classification approach was rejected in favor of a binary classification method, due to its ability to handle variable number of candidates per user without necessitating the need to retrain models.</w:t>
       </w:r>
     </w:p>
     <w:p>
       <w:pPr>
-        <w:pStyle w:val="ListParagraph"/>
         <w:numPr>
           <w:ilvl w:val="0"/>
-          <w:numId w:val="14"/>
+          <w:numId w:val="23"/>
         </w:numPr>
         <w:jc w:val="both"/>
         <w:rPr>
@@ -1436,16 +1358,7 @@
           <w:sz w:val="20"/>
           <w:szCs w:val="20"/>
         </w:rPr>
-        <w:t>FeatureEngineering</w:t>
-      </w:r>
-      <w:r>
-        <w:rPr>
-          <w:rFonts w:ascii="Times New Roman" w:hAnsi="Times New Roman" w:cs="Times New Roman"/>
-          <w:bCs/>
-          <w:sz w:val="20"/>
-          <w:szCs w:val="20"/>
-        </w:rPr>
-        <w:br/>
+        <w:t>Feature Engineering</w:t>
       </w:r>
     </w:p>
     <w:p>
@@ -1465,7 +1378,25 @@
           <w:sz w:val="20"/>
           <w:szCs w:val="20"/>
         </w:rPr>
-        <w:t>The routing decisions are dependent upon information about the current notification</w:t>
+        <w:t xml:space="preserve">The routing decisions are dependent upon the </w:t>
+      </w:r>
+      <w:r>
+        <w:rPr>
+          <w:rFonts w:ascii="Times New Roman" w:hAnsi="Times New Roman" w:cs="Times New Roman"/>
+          <w:bCs/>
+          <w:sz w:val="20"/>
+          <w:szCs w:val="20"/>
+        </w:rPr>
+        <w:t>15-attribute</w:t>
+      </w:r>
+      <w:r>
+        <w:rPr>
+          <w:rFonts w:ascii="Times New Roman" w:hAnsi="Times New Roman" w:cs="Times New Roman"/>
+          <w:bCs/>
+          <w:sz w:val="20"/>
+          <w:szCs w:val="20"/>
+        </w:rPr>
+        <w:t xml:space="preserve"> vector of information about the current notification</w:t>
       </w:r>
       <w:r>
         <w:rPr>
@@ -1483,15 +1414,32 @@
           <w:sz w:val="20"/>
           <w:szCs w:val="20"/>
         </w:rPr>
-        <w:t>s context and routing decision; as well as, the individuals past engagement per channel.</w:t>
+        <w:t xml:space="preserve">s context and routing decision; </w:t>
+      </w:r>
+      <w:r>
+        <w:rPr>
+          <w:rFonts w:ascii="Times New Roman" w:hAnsi="Times New Roman" w:cs="Times New Roman"/>
+          <w:bCs/>
+          <w:sz w:val="20"/>
+          <w:szCs w:val="20"/>
+        </w:rPr>
+        <w:t>as well as</w:t>
+      </w:r>
+      <w:r>
+        <w:rPr>
+          <w:rFonts w:ascii="Times New Roman" w:hAnsi="Times New Roman" w:cs="Times New Roman"/>
+          <w:bCs/>
+          <w:sz w:val="20"/>
+          <w:szCs w:val="20"/>
+        </w:rPr>
+        <w:t xml:space="preserve"> the individuals past engagement per channel. </w:t>
       </w:r>
     </w:p>
     <w:p>
       <w:pPr>
-        <w:pStyle w:val="ListParagraph"/>
         <w:numPr>
           <w:ilvl w:val="0"/>
-          <w:numId w:val="14"/>
+          <w:numId w:val="24"/>
         </w:numPr>
         <w:jc w:val="both"/>
         <w:rPr>
@@ -1508,16 +1456,8 @@
           <w:sz w:val="20"/>
           <w:szCs w:val="20"/>
         </w:rPr>
-        <w:t>Model Architectur</w:t>
-      </w:r>
-      <w:r>
-        <w:rPr>
-          <w:rFonts w:ascii="Times New Roman" w:hAnsi="Times New Roman" w:cs="Times New Roman"/>
-          <w:bCs/>
-          <w:sz w:val="20"/>
-          <w:szCs w:val="20"/>
-        </w:rPr>
-        <w:t>e</w:t>
+        <w:lastRenderedPageBreak/>
+        <w:t>Model Architecture</w:t>
       </w:r>
     </w:p>
     <w:p>
@@ -1537,7 +1477,25 @@
           <w:sz w:val="20"/>
           <w:szCs w:val="20"/>
         </w:rPr>
-        <w:t xml:space="preserve">The ML service utilizes a trained binary classifier (XGBoost) which has been trained on all delivery attempts e.g. “engaged” in the delivery_attempts table </w:t>
+        <w:t xml:space="preserve">The ML service utilizes a trained binary classifier (XGBoost) which has been trained on all delivery attempts e.g. “engaged” in the </w:t>
+      </w:r>
+      <w:r>
+        <w:rPr>
+          <w:rFonts w:ascii="Times New Roman" w:hAnsi="Times New Roman" w:cs="Times New Roman"/>
+          <w:bCs/>
+          <w:sz w:val="20"/>
+          <w:szCs w:val="20"/>
+        </w:rPr>
+        <w:t>delivery attempts</w:t>
+      </w:r>
+      <w:r>
+        <w:rPr>
+          <w:rFonts w:ascii="Times New Roman" w:hAnsi="Times New Roman" w:cs="Times New Roman"/>
+          <w:bCs/>
+          <w:sz w:val="20"/>
+          <w:szCs w:val="20"/>
+        </w:rPr>
+        <w:t xml:space="preserve"> table </w:t>
       </w:r>
       <w:r>
         <w:rPr>
@@ -1560,10 +1518,29 @@
     </w:p>
     <w:p>
       <w:pPr>
-        <w:pStyle w:val="ListParagraph"/>
+        <w:jc w:val="both"/>
+        <w:rPr>
+          <w:rFonts w:ascii="Times New Roman" w:hAnsi="Times New Roman" w:cs="Times New Roman"/>
+          <w:bCs/>
+          <w:sz w:val="20"/>
+          <w:szCs w:val="20"/>
+        </w:rPr>
+      </w:pPr>
+      <w:r>
+        <w:rPr>
+          <w:rFonts w:ascii="Times New Roman" w:hAnsi="Times New Roman" w:cs="Times New Roman"/>
+          <w:bCs/>
+          <w:sz w:val="20"/>
+          <w:szCs w:val="20"/>
+        </w:rPr>
+        <w:t>The model is trained on an 80 / 20 ratio meaning 80% of delivery attempts are used for training and 20% are used to test against the data the model hasn’t seen yet. It will be assessed with the following metrics AUC-ROC (how well the model ranks engaged recipients above non-engaged ones across all decision thresholds), precision (how often a predicted engagement was correct), recall (how many engagements the model caught), and F1 (a combined score that is high only when the model is both accurate in what it predicts and through what it catches). A new model only replaces the current one if it achieves a higher AUC-ROC.</w:t>
+      </w:r>
+    </w:p>
+    <w:p>
+      <w:pPr>
         <w:numPr>
           <w:ilvl w:val="0"/>
-          <w:numId w:val="14"/>
+          <w:numId w:val="25"/>
         </w:numPr>
         <w:jc w:val="both"/>
         <w:rPr>
@@ -1600,15 +1577,14 @@
           <w:sz w:val="20"/>
           <w:szCs w:val="20"/>
         </w:rPr>
-        <w:t>The epsilon-greedy strategy provides balance when choosing to exploit the knowledge that has been learned by the model. In this case that’s which channel is most likely to result in engagement against the opportunities for exploration of the other channels that have less engagement from the individual.</w:t>
+        <w:t>The epsilon-greedy strategy provides balance when choosing to exploit the knowledge that has been learned by the model. In this case that’s which channel is most likely to result in engagement against the opportunities for exploration of the other channels that have less engagement from the individual. By using an epsilon of .10 that means 90% of all routing decision will be based upon the channel(s) with the greatest predicted engagement probability while 10% of the time a channel will be randomly selected.</w:t>
       </w:r>
     </w:p>
     <w:p>
       <w:pPr>
-        <w:pStyle w:val="ListParagraph"/>
         <w:numPr>
           <w:ilvl w:val="0"/>
-          <w:numId w:val="14"/>
+          <w:numId w:val="26"/>
         </w:numPr>
         <w:jc w:val="both"/>
         <w:rPr>
@@ -1645,11 +1621,12 @@
           <w:sz w:val="20"/>
           <w:szCs w:val="20"/>
         </w:rPr>
-        <w:t>The ML is an optional service, when the ML service cannot be reached the worker will use a static based priority routing instead of predicting the best way to route the notification to the individual through the model.</w:t>
+        <w:t>The ML service is an improvement to the delivery pipeline, not a prerequisite. If the ML service is unavailable, the worker falls back to static priority-based routing. The notification is still delivered; it is just routed using configured channel priorities rather than model predictions. The notification pipeline never fails due to ML service downtime.</w:t>
       </w:r>
     </w:p>
     <w:p>
       <w:pPr>
+        <w:jc w:val="both"/>
         <w:rPr>
           <w:rFonts w:ascii="Times New Roman" w:hAnsi="Times New Roman" w:cs="Times New Roman"/>
           <w:bCs/>
@@ -1660,28 +1637,8 @@
     </w:p>
     <w:p>
       <w:pPr>
-        <w:rPr>
-          <w:rFonts w:ascii="Times New Roman" w:hAnsi="Times New Roman" w:cs="Times New Roman"/>
-          <w:bCs/>
-          <w:sz w:val="20"/>
-          <w:szCs w:val="20"/>
-        </w:rPr>
-      </w:pPr>
-    </w:p>
-    <w:p>
-      <w:pPr>
         <w:ind w:firstLine="0"/>
-        <w:rPr>
-          <w:rFonts w:ascii="Times New Roman" w:hAnsi="Times New Roman" w:cs="Times New Roman"/>
-          <w:bCs/>
-          <w:sz w:val="20"/>
-          <w:szCs w:val="20"/>
-        </w:rPr>
-      </w:pPr>
-    </w:p>
-    <w:p>
-      <w:pPr>
-        <w:ind w:firstLine="0"/>
+        <w:jc w:val="center"/>
         <w:rPr>
           <w:rFonts w:ascii="Times New Roman" w:hAnsi="Times New Roman" w:cs="Times New Roman"/>
           <w:bCs/>
@@ -1696,8 +1653,7 @@
           <w:sz w:val="20"/>
           <w:szCs w:val="20"/>
         </w:rPr>
-        <w:lastRenderedPageBreak/>
-        <w:t>V. EXPERIMENTAL SETUP (Expanded)</w:t>
+        <w:t>V. EXPERIMENTAL SETUP</w:t>
       </w:r>
     </w:p>
     <w:p>
@@ -1869,7 +1825,7 @@
     </w:p>
     <w:p>
       <w:pPr>
-        <w:ind w:firstLine="0"/>
+        <w:jc w:val="both"/>
         <w:rPr>
           <w:rFonts w:ascii="Times New Roman" w:hAnsi="Times New Roman" w:cs="Times New Roman"/>
           <w:bCs/>
@@ -1881,6 +1837,7 @@
     <w:p>
       <w:pPr>
         <w:ind w:firstLine="0"/>
+        <w:jc w:val="center"/>
         <w:rPr>
           <w:rFonts w:ascii="Times New Roman" w:hAnsi="Times New Roman" w:cs="Times New Roman"/>
           <w:bCs/>
@@ -1895,7 +1852,7 @@
           <w:sz w:val="20"/>
           <w:szCs w:val="20"/>
         </w:rPr>
-        <w:t xml:space="preserve">VI. RESULTS </w:t>
+        <w:t>VI. RESULTS</w:t>
       </w:r>
     </w:p>
     <w:p>
@@ -1940,7 +1897,6 @@
     </w:p>
     <w:p>
       <w:pPr>
-        <w:ind w:firstLine="0"/>
         <w:jc w:val="both"/>
         <w:rPr>
           <w:rFonts w:ascii="Times New Roman" w:hAnsi="Times New Roman" w:cs="Times New Roman"/>
@@ -1953,7 +1909,7 @@
     <w:p>
       <w:pPr>
         <w:ind w:firstLine="0"/>
-        <w:jc w:val="both"/>
+        <w:jc w:val="center"/>
         <w:rPr>
           <w:rFonts w:ascii="Times New Roman" w:hAnsi="Times New Roman" w:cs="Times New Roman"/>
           <w:bCs/>
@@ -2013,7 +1969,6 @@
     </w:p>
     <w:p>
       <w:pPr>
-        <w:ind w:firstLine="0"/>
         <w:jc w:val="both"/>
         <w:rPr>
           <w:rFonts w:ascii="Times New Roman" w:hAnsi="Times New Roman" w:cs="Times New Roman"/>
@@ -2026,7 +1981,7 @@
     <w:p>
       <w:pPr>
         <w:ind w:firstLine="0"/>
-        <w:jc w:val="both"/>
+        <w:jc w:val="center"/>
         <w:rPr>
           <w:rFonts w:ascii="Times New Roman" w:hAnsi="Times New Roman" w:cs="Times New Roman"/>
           <w:bCs/>
@@ -2086,7 +2041,6 @@
     </w:p>
     <w:p>
       <w:pPr>
-        <w:ind w:firstLine="0"/>
         <w:jc w:val="both"/>
         <w:rPr>
           <w:rFonts w:ascii="Times New Roman" w:hAnsi="Times New Roman" w:cs="Times New Roman"/>
@@ -2098,8 +2052,30 @@
     </w:p>
     <w:p>
       <w:pPr>
+        <w:jc w:val="both"/>
+        <w:rPr>
+          <w:rFonts w:ascii="Times New Roman" w:hAnsi="Times New Roman" w:cs="Times New Roman"/>
+          <w:bCs/>
+          <w:sz w:val="20"/>
+          <w:szCs w:val="20"/>
+        </w:rPr>
+      </w:pPr>
+    </w:p>
+    <w:p>
+      <w:pPr>
+        <w:jc w:val="both"/>
+        <w:rPr>
+          <w:rFonts w:ascii="Times New Roman" w:hAnsi="Times New Roman" w:cs="Times New Roman"/>
+          <w:bCs/>
+          <w:sz w:val="20"/>
+          <w:szCs w:val="20"/>
+        </w:rPr>
+      </w:pPr>
+    </w:p>
+    <w:p>
+      <w:pPr>
         <w:ind w:firstLine="0"/>
-        <w:jc w:val="both"/>
+        <w:jc w:val="center"/>
         <w:rPr>
           <w:rFonts w:ascii="Times New Roman" w:hAnsi="Times New Roman" w:cs="Times New Roman"/>
           <w:bCs/>
@@ -2168,7 +2144,6 @@
     </w:p>
     <w:p>
       <w:pPr>
-        <w:ind w:firstLine="0"/>
         <w:jc w:val="both"/>
         <w:rPr>
           <w:rFonts w:ascii="Times New Roman" w:hAnsi="Times New Roman" w:cs="Times New Roman"/>
@@ -2181,7 +2156,7 @@
     <w:p>
       <w:pPr>
         <w:ind w:firstLine="0"/>
-        <w:jc w:val="both"/>
+        <w:jc w:val="center"/>
         <w:rPr>
           <w:rFonts w:ascii="Times New Roman" w:hAnsi="Times New Roman" w:cs="Times New Roman"/>
           <w:bCs/>
@@ -2221,6 +2196,17 @@
     </w:p>
     <w:p>
       <w:pPr>
+        <w:jc w:val="both"/>
+        <w:rPr>
+          <w:rFonts w:ascii="Times New Roman" w:hAnsi="Times New Roman" w:cs="Times New Roman"/>
+          <w:bCs/>
+          <w:sz w:val="20"/>
+          <w:szCs w:val="20"/>
+        </w:rPr>
+      </w:pPr>
+    </w:p>
+    <w:p>
+      <w:pPr>
         <w:ind w:firstLine="0"/>
         <w:jc w:val="both"/>
         <w:rPr>
@@ -2230,18 +2216,6 @@
           <w:szCs w:val="20"/>
         </w:rPr>
       </w:pPr>
-    </w:p>
-    <w:p>
-      <w:pPr>
-        <w:ind w:firstLine="0"/>
-        <w:jc w:val="both"/>
-        <w:rPr>
-          <w:rFonts w:ascii="Times New Roman" w:hAnsi="Times New Roman" w:cs="Times New Roman"/>
-          <w:bCs/>
-          <w:sz w:val="20"/>
-          <w:szCs w:val="20"/>
-        </w:rPr>
-      </w:pPr>
       <w:r>
         <w:rPr>
           <w:rFonts w:ascii="Times New Roman" w:hAnsi="Times New Roman" w:cs="Times New Roman"/>
@@ -2249,104 +2223,6 @@
           <w:sz w:val="20"/>
           <w:szCs w:val="20"/>
         </w:rPr>
-        <w:t>VII. CONCLUSION</w:t>
-      </w:r>
-    </w:p>
-    <w:p>
-      <w:pPr>
-        <w:jc w:val="both"/>
-        <w:rPr>
-          <w:rFonts w:ascii="Times New Roman" w:hAnsi="Times New Roman" w:cs="Times New Roman"/>
-          <w:bCs/>
-          <w:sz w:val="20"/>
-          <w:szCs w:val="20"/>
-        </w:rPr>
-      </w:pPr>
-      <w:r>
-        <w:rPr>
-          <w:rFonts w:ascii="Times New Roman" w:hAnsi="Times New Roman" w:cs="Times New Roman"/>
-          <w:bCs/>
-          <w:sz w:val="20"/>
-          <w:szCs w:val="20"/>
-        </w:rPr>
-        <w:t>AlgoRhythms introduces a novel approach to notification routing by treating communication as an adaptive sequence. By integrating predictive modeling, exploration strategies, and fault tolerance, the system achieves improved delivery performance and user engagement.</w:t>
-      </w:r>
-    </w:p>
-    <w:p>
-      <w:pPr>
-        <w:jc w:val="both"/>
-        <w:rPr>
-          <w:rFonts w:ascii="Times New Roman" w:hAnsi="Times New Roman" w:cs="Times New Roman"/>
-          <w:bCs/>
-          <w:sz w:val="20"/>
-          <w:szCs w:val="20"/>
-        </w:rPr>
-      </w:pPr>
-      <w:r>
-        <w:rPr>
-          <w:rFonts w:ascii="Times New Roman" w:hAnsi="Times New Roman" w:cs="Times New Roman"/>
-          <w:bCs/>
-          <w:sz w:val="20"/>
-          <w:szCs w:val="20"/>
-        </w:rPr>
-        <w:t>This work demonstrates the potential of combining machine learning with system design to create intelligent, self-optimizing notification systems.</w:t>
-      </w:r>
-    </w:p>
-    <w:p>
-      <w:pPr>
-        <w:ind w:firstLine="0"/>
-        <w:jc w:val="both"/>
-        <w:rPr>
-          <w:rFonts w:ascii="Times New Roman" w:hAnsi="Times New Roman" w:cs="Times New Roman"/>
-          <w:bCs/>
-          <w:sz w:val="20"/>
-          <w:szCs w:val="20"/>
-        </w:rPr>
-      </w:pPr>
-    </w:p>
-    <w:p>
-      <w:pPr>
-        <w:ind w:firstLine="0"/>
-        <w:jc w:val="both"/>
-        <w:rPr>
-          <w:rFonts w:ascii="Times New Roman" w:hAnsi="Times New Roman" w:cs="Times New Roman"/>
-          <w:bCs/>
-          <w:sz w:val="20"/>
-          <w:szCs w:val="20"/>
-        </w:rPr>
-      </w:pPr>
-    </w:p>
-    <w:p>
-      <w:pPr>
-        <w:ind w:firstLine="0"/>
-        <w:jc w:val="both"/>
-        <w:rPr>
-          <w:rFonts w:ascii="Times New Roman" w:hAnsi="Times New Roman" w:cs="Times New Roman"/>
-          <w:bCs/>
-          <w:sz w:val="20"/>
-          <w:szCs w:val="20"/>
-        </w:rPr>
-      </w:pPr>
-    </w:p>
-    <w:p>
-      <w:pPr>
-        <w:ind w:firstLine="0"/>
-        <w:jc w:val="both"/>
-        <w:rPr>
-          <w:rFonts w:ascii="Times New Roman" w:hAnsi="Times New Roman" w:cs="Times New Roman"/>
-          <w:bCs/>
-          <w:sz w:val="20"/>
-          <w:szCs w:val="20"/>
-        </w:rPr>
-      </w:pPr>
-      <w:r>
-        <w:rPr>
-          <w:rFonts w:ascii="Times New Roman" w:hAnsi="Times New Roman" w:cs="Times New Roman"/>
-          <w:bCs/>
-          <w:sz w:val="20"/>
-          <w:szCs w:val="20"/>
-        </w:rPr>
-        <w:lastRenderedPageBreak/>
         <w:t>REFERENCES</w:t>
       </w:r>
     </w:p>
@@ -2604,6 +2480,92 @@
     </w:lvl>
   </w:abstractNum>
   <w:abstractNum w:abstractNumId="9" w15:restartNumberingAfterBreak="0">
+    <w:nsid w:val="0A6871B9"/>
+    <w:multiLevelType w:val="hybridMultilevel"/>
+    <w:tmpl w:val="69FA0142"/>
+    <w:lvl w:ilvl="0" w:tplc="04090015">
+      <w:start w:val="1"/>
+      <w:numFmt w:val="upperLetter"/>
+      <w:lvlText w:val="%1."/>
+      <w:lvlJc w:val="left"/>
+      <w:pPr>
+        <w:ind w:left="720" w:hanging="360"/>
+      </w:pPr>
+    </w:lvl>
+    <w:lvl w:ilvl="1" w:tplc="04090019" w:tentative="1">
+      <w:start w:val="1"/>
+      <w:numFmt w:val="lowerLetter"/>
+      <w:lvlText w:val="%2."/>
+      <w:lvlJc w:val="left"/>
+      <w:pPr>
+        <w:ind w:left="1440" w:hanging="360"/>
+      </w:pPr>
+    </w:lvl>
+    <w:lvl w:ilvl="2" w:tplc="0409001B" w:tentative="1">
+      <w:start w:val="1"/>
+      <w:numFmt w:val="lowerRoman"/>
+      <w:lvlText w:val="%3."/>
+      <w:lvlJc w:val="right"/>
+      <w:pPr>
+        <w:ind w:left="2160" w:hanging="180"/>
+      </w:pPr>
+    </w:lvl>
+    <w:lvl w:ilvl="3" w:tplc="0409000F" w:tentative="1">
+      <w:start w:val="1"/>
+      <w:numFmt w:val="decimal"/>
+      <w:lvlText w:val="%4."/>
+      <w:lvlJc w:val="left"/>
+      <w:pPr>
+        <w:ind w:left="2880" w:hanging="360"/>
+      </w:pPr>
+    </w:lvl>
+    <w:lvl w:ilvl="4" w:tplc="04090019" w:tentative="1">
+      <w:start w:val="1"/>
+      <w:numFmt w:val="lowerLetter"/>
+      <w:lvlText w:val="%5."/>
+      <w:lvlJc w:val="left"/>
+      <w:pPr>
+        <w:ind w:left="3600" w:hanging="360"/>
+      </w:pPr>
+    </w:lvl>
+    <w:lvl w:ilvl="5" w:tplc="0409001B" w:tentative="1">
+      <w:start w:val="1"/>
+      <w:numFmt w:val="lowerRoman"/>
+      <w:lvlText w:val="%6."/>
+      <w:lvlJc w:val="right"/>
+      <w:pPr>
+        <w:ind w:left="4320" w:hanging="180"/>
+      </w:pPr>
+    </w:lvl>
+    <w:lvl w:ilvl="6" w:tplc="0409000F" w:tentative="1">
+      <w:start w:val="1"/>
+      <w:numFmt w:val="decimal"/>
+      <w:lvlText w:val="%7."/>
+      <w:lvlJc w:val="left"/>
+      <w:pPr>
+        <w:ind w:left="5040" w:hanging="360"/>
+      </w:pPr>
+    </w:lvl>
+    <w:lvl w:ilvl="7" w:tplc="04090019" w:tentative="1">
+      <w:start w:val="1"/>
+      <w:numFmt w:val="lowerLetter"/>
+      <w:lvlText w:val="%8."/>
+      <w:lvlJc w:val="left"/>
+      <w:pPr>
+        <w:ind w:left="5760" w:hanging="360"/>
+      </w:pPr>
+    </w:lvl>
+    <w:lvl w:ilvl="8" w:tplc="0409001B" w:tentative="1">
+      <w:start w:val="1"/>
+      <w:numFmt w:val="lowerRoman"/>
+      <w:lvlText w:val="%9."/>
+      <w:lvlJc w:val="right"/>
+      <w:pPr>
+        <w:ind w:left="6480" w:hanging="180"/>
+      </w:pPr>
+    </w:lvl>
+  </w:abstractNum>
+  <w:abstractNum w:abstractNumId="10" w15:restartNumberingAfterBreak="0">
     <w:nsid w:val="0C182E9E"/>
     <w:multiLevelType w:val="multilevel"/>
     <w:tmpl w:val="5D062998"/>
@@ -2752,7 +2714,744 @@
       </w:rPr>
     </w:lvl>
   </w:abstractNum>
-  <w:abstractNum w:abstractNumId="10" w15:restartNumberingAfterBreak="0">
+  <w:abstractNum w:abstractNumId="11" w15:restartNumberingAfterBreak="0">
+    <w:nsid w:val="0F2D55B9"/>
+    <w:multiLevelType w:val="hybridMultilevel"/>
+    <w:tmpl w:val="B3BA9A7C"/>
+    <w:lvl w:ilvl="0" w:tplc="1B8C2164">
+      <w:start w:val="3"/>
+      <w:numFmt w:val="upperLetter"/>
+      <w:lvlText w:val="%1."/>
+      <w:lvlJc w:val="left"/>
+      <w:pPr>
+        <w:tabs>
+          <w:tab w:val="num" w:pos="720"/>
+        </w:tabs>
+        <w:ind w:left="720" w:hanging="360"/>
+      </w:pPr>
+    </w:lvl>
+    <w:lvl w:ilvl="1" w:tplc="3BA81962" w:tentative="1">
+      <w:start w:val="1"/>
+      <w:numFmt w:val="decimal"/>
+      <w:lvlText w:val="%2."/>
+      <w:lvlJc w:val="left"/>
+      <w:pPr>
+        <w:tabs>
+          <w:tab w:val="num" w:pos="1440"/>
+        </w:tabs>
+        <w:ind w:left="1440" w:hanging="360"/>
+      </w:pPr>
+    </w:lvl>
+    <w:lvl w:ilvl="2" w:tplc="4D5AD616" w:tentative="1">
+      <w:start w:val="1"/>
+      <w:numFmt w:val="decimal"/>
+      <w:lvlText w:val="%3."/>
+      <w:lvlJc w:val="left"/>
+      <w:pPr>
+        <w:tabs>
+          <w:tab w:val="num" w:pos="2160"/>
+        </w:tabs>
+        <w:ind w:left="2160" w:hanging="360"/>
+      </w:pPr>
+    </w:lvl>
+    <w:lvl w:ilvl="3" w:tplc="A8320F60" w:tentative="1">
+      <w:start w:val="1"/>
+      <w:numFmt w:val="decimal"/>
+      <w:lvlText w:val="%4."/>
+      <w:lvlJc w:val="left"/>
+      <w:pPr>
+        <w:tabs>
+          <w:tab w:val="num" w:pos="2880"/>
+        </w:tabs>
+        <w:ind w:left="2880" w:hanging="360"/>
+      </w:pPr>
+    </w:lvl>
+    <w:lvl w:ilvl="4" w:tplc="3A762B0E" w:tentative="1">
+      <w:start w:val="1"/>
+      <w:numFmt w:val="decimal"/>
+      <w:lvlText w:val="%5."/>
+      <w:lvlJc w:val="left"/>
+      <w:pPr>
+        <w:tabs>
+          <w:tab w:val="num" w:pos="3600"/>
+        </w:tabs>
+        <w:ind w:left="3600" w:hanging="360"/>
+      </w:pPr>
+    </w:lvl>
+    <w:lvl w:ilvl="5" w:tplc="1F98569E" w:tentative="1">
+      <w:start w:val="1"/>
+      <w:numFmt w:val="decimal"/>
+      <w:lvlText w:val="%6."/>
+      <w:lvlJc w:val="left"/>
+      <w:pPr>
+        <w:tabs>
+          <w:tab w:val="num" w:pos="4320"/>
+        </w:tabs>
+        <w:ind w:left="4320" w:hanging="360"/>
+      </w:pPr>
+    </w:lvl>
+    <w:lvl w:ilvl="6" w:tplc="4B12492A" w:tentative="1">
+      <w:start w:val="1"/>
+      <w:numFmt w:val="decimal"/>
+      <w:lvlText w:val="%7."/>
+      <w:lvlJc w:val="left"/>
+      <w:pPr>
+        <w:tabs>
+          <w:tab w:val="num" w:pos="5040"/>
+        </w:tabs>
+        <w:ind w:left="5040" w:hanging="360"/>
+      </w:pPr>
+    </w:lvl>
+    <w:lvl w:ilvl="7" w:tplc="6362181A" w:tentative="1">
+      <w:start w:val="1"/>
+      <w:numFmt w:val="decimal"/>
+      <w:lvlText w:val="%8."/>
+      <w:lvlJc w:val="left"/>
+      <w:pPr>
+        <w:tabs>
+          <w:tab w:val="num" w:pos="5760"/>
+        </w:tabs>
+        <w:ind w:left="5760" w:hanging="360"/>
+      </w:pPr>
+    </w:lvl>
+    <w:lvl w:ilvl="8" w:tplc="1E60A082" w:tentative="1">
+      <w:start w:val="1"/>
+      <w:numFmt w:val="decimal"/>
+      <w:lvlText w:val="%9."/>
+      <w:lvlJc w:val="left"/>
+      <w:pPr>
+        <w:tabs>
+          <w:tab w:val="num" w:pos="6480"/>
+        </w:tabs>
+        <w:ind w:left="6480" w:hanging="360"/>
+      </w:pPr>
+    </w:lvl>
+  </w:abstractNum>
+  <w:abstractNum w:abstractNumId="12" w15:restartNumberingAfterBreak="0">
+    <w:nsid w:val="16AA36FE"/>
+    <w:multiLevelType w:val="multilevel"/>
+    <w:tmpl w:val="C14633D4"/>
+    <w:lvl w:ilvl="0">
+      <w:start w:val="1"/>
+      <w:numFmt w:val="decimal"/>
+      <w:lvlText w:val="%1."/>
+      <w:lvlJc w:val="left"/>
+      <w:pPr>
+        <w:tabs>
+          <w:tab w:val="num" w:pos="720"/>
+        </w:tabs>
+        <w:ind w:left="720" w:hanging="360"/>
+      </w:pPr>
+    </w:lvl>
+    <w:lvl w:ilvl="1" w:tentative="1">
+      <w:start w:val="1"/>
+      <w:numFmt w:val="decimal"/>
+      <w:lvlText w:val="%2."/>
+      <w:lvlJc w:val="left"/>
+      <w:pPr>
+        <w:tabs>
+          <w:tab w:val="num" w:pos="1440"/>
+        </w:tabs>
+        <w:ind w:left="1440" w:hanging="360"/>
+      </w:pPr>
+    </w:lvl>
+    <w:lvl w:ilvl="2" w:tentative="1">
+      <w:start w:val="1"/>
+      <w:numFmt w:val="decimal"/>
+      <w:lvlText w:val="%3."/>
+      <w:lvlJc w:val="left"/>
+      <w:pPr>
+        <w:tabs>
+          <w:tab w:val="num" w:pos="2160"/>
+        </w:tabs>
+        <w:ind w:left="2160" w:hanging="360"/>
+      </w:pPr>
+    </w:lvl>
+    <w:lvl w:ilvl="3" w:tentative="1">
+      <w:start w:val="1"/>
+      <w:numFmt w:val="decimal"/>
+      <w:lvlText w:val="%4."/>
+      <w:lvlJc w:val="left"/>
+      <w:pPr>
+        <w:tabs>
+          <w:tab w:val="num" w:pos="2880"/>
+        </w:tabs>
+        <w:ind w:left="2880" w:hanging="360"/>
+      </w:pPr>
+    </w:lvl>
+    <w:lvl w:ilvl="4" w:tentative="1">
+      <w:start w:val="1"/>
+      <w:numFmt w:val="decimal"/>
+      <w:lvlText w:val="%5."/>
+      <w:lvlJc w:val="left"/>
+      <w:pPr>
+        <w:tabs>
+          <w:tab w:val="num" w:pos="3600"/>
+        </w:tabs>
+        <w:ind w:left="3600" w:hanging="360"/>
+      </w:pPr>
+    </w:lvl>
+    <w:lvl w:ilvl="5" w:tentative="1">
+      <w:start w:val="1"/>
+      <w:numFmt w:val="decimal"/>
+      <w:lvlText w:val="%6."/>
+      <w:lvlJc w:val="left"/>
+      <w:pPr>
+        <w:tabs>
+          <w:tab w:val="num" w:pos="4320"/>
+        </w:tabs>
+        <w:ind w:left="4320" w:hanging="360"/>
+      </w:pPr>
+    </w:lvl>
+    <w:lvl w:ilvl="6" w:tentative="1">
+      <w:start w:val="1"/>
+      <w:numFmt w:val="decimal"/>
+      <w:lvlText w:val="%7."/>
+      <w:lvlJc w:val="left"/>
+      <w:pPr>
+        <w:tabs>
+          <w:tab w:val="num" w:pos="5040"/>
+        </w:tabs>
+        <w:ind w:left="5040" w:hanging="360"/>
+      </w:pPr>
+    </w:lvl>
+    <w:lvl w:ilvl="7" w:tentative="1">
+      <w:start w:val="1"/>
+      <w:numFmt w:val="decimal"/>
+      <w:lvlText w:val="%8."/>
+      <w:lvlJc w:val="left"/>
+      <w:pPr>
+        <w:tabs>
+          <w:tab w:val="num" w:pos="5760"/>
+        </w:tabs>
+        <w:ind w:left="5760" w:hanging="360"/>
+      </w:pPr>
+    </w:lvl>
+    <w:lvl w:ilvl="8" w:tentative="1">
+      <w:start w:val="1"/>
+      <w:numFmt w:val="decimal"/>
+      <w:lvlText w:val="%9."/>
+      <w:lvlJc w:val="left"/>
+      <w:pPr>
+        <w:tabs>
+          <w:tab w:val="num" w:pos="6480"/>
+        </w:tabs>
+        <w:ind w:left="6480" w:hanging="360"/>
+      </w:pPr>
+    </w:lvl>
+  </w:abstractNum>
+  <w:abstractNum w:abstractNumId="13" w15:restartNumberingAfterBreak="0">
+    <w:nsid w:val="1DBD0A68"/>
+    <w:multiLevelType w:val="hybridMultilevel"/>
+    <w:tmpl w:val="BF966E9A"/>
+    <w:lvl w:ilvl="0" w:tplc="6392602A">
+      <w:start w:val="2"/>
+      <w:numFmt w:val="upperLetter"/>
+      <w:lvlText w:val="%1."/>
+      <w:lvlJc w:val="left"/>
+      <w:pPr>
+        <w:tabs>
+          <w:tab w:val="num" w:pos="720"/>
+        </w:tabs>
+        <w:ind w:left="720" w:hanging="360"/>
+      </w:pPr>
+    </w:lvl>
+    <w:lvl w:ilvl="1" w:tplc="BAE0CC7E" w:tentative="1">
+      <w:start w:val="1"/>
+      <w:numFmt w:val="decimal"/>
+      <w:lvlText w:val="%2."/>
+      <w:lvlJc w:val="left"/>
+      <w:pPr>
+        <w:tabs>
+          <w:tab w:val="num" w:pos="1440"/>
+        </w:tabs>
+        <w:ind w:left="1440" w:hanging="360"/>
+      </w:pPr>
+    </w:lvl>
+    <w:lvl w:ilvl="2" w:tplc="72DE2EFE" w:tentative="1">
+      <w:start w:val="1"/>
+      <w:numFmt w:val="decimal"/>
+      <w:lvlText w:val="%3."/>
+      <w:lvlJc w:val="left"/>
+      <w:pPr>
+        <w:tabs>
+          <w:tab w:val="num" w:pos="2160"/>
+        </w:tabs>
+        <w:ind w:left="2160" w:hanging="360"/>
+      </w:pPr>
+    </w:lvl>
+    <w:lvl w:ilvl="3" w:tplc="0EFAF788" w:tentative="1">
+      <w:start w:val="1"/>
+      <w:numFmt w:val="decimal"/>
+      <w:lvlText w:val="%4."/>
+      <w:lvlJc w:val="left"/>
+      <w:pPr>
+        <w:tabs>
+          <w:tab w:val="num" w:pos="2880"/>
+        </w:tabs>
+        <w:ind w:left="2880" w:hanging="360"/>
+      </w:pPr>
+    </w:lvl>
+    <w:lvl w:ilvl="4" w:tplc="CC0ED6AA" w:tentative="1">
+      <w:start w:val="1"/>
+      <w:numFmt w:val="decimal"/>
+      <w:lvlText w:val="%5."/>
+      <w:lvlJc w:val="left"/>
+      <w:pPr>
+        <w:tabs>
+          <w:tab w:val="num" w:pos="3600"/>
+        </w:tabs>
+        <w:ind w:left="3600" w:hanging="360"/>
+      </w:pPr>
+    </w:lvl>
+    <w:lvl w:ilvl="5" w:tplc="ED3811D2" w:tentative="1">
+      <w:start w:val="1"/>
+      <w:numFmt w:val="decimal"/>
+      <w:lvlText w:val="%6."/>
+      <w:lvlJc w:val="left"/>
+      <w:pPr>
+        <w:tabs>
+          <w:tab w:val="num" w:pos="4320"/>
+        </w:tabs>
+        <w:ind w:left="4320" w:hanging="360"/>
+      </w:pPr>
+    </w:lvl>
+    <w:lvl w:ilvl="6" w:tplc="237CA60A" w:tentative="1">
+      <w:start w:val="1"/>
+      <w:numFmt w:val="decimal"/>
+      <w:lvlText w:val="%7."/>
+      <w:lvlJc w:val="left"/>
+      <w:pPr>
+        <w:tabs>
+          <w:tab w:val="num" w:pos="5040"/>
+        </w:tabs>
+        <w:ind w:left="5040" w:hanging="360"/>
+      </w:pPr>
+    </w:lvl>
+    <w:lvl w:ilvl="7" w:tplc="690C5FF2" w:tentative="1">
+      <w:start w:val="1"/>
+      <w:numFmt w:val="decimal"/>
+      <w:lvlText w:val="%8."/>
+      <w:lvlJc w:val="left"/>
+      <w:pPr>
+        <w:tabs>
+          <w:tab w:val="num" w:pos="5760"/>
+        </w:tabs>
+        <w:ind w:left="5760" w:hanging="360"/>
+      </w:pPr>
+    </w:lvl>
+    <w:lvl w:ilvl="8" w:tplc="1A8CBFE8" w:tentative="1">
+      <w:start w:val="1"/>
+      <w:numFmt w:val="decimal"/>
+      <w:lvlText w:val="%9."/>
+      <w:lvlJc w:val="left"/>
+      <w:pPr>
+        <w:tabs>
+          <w:tab w:val="num" w:pos="6480"/>
+        </w:tabs>
+        <w:ind w:left="6480" w:hanging="360"/>
+      </w:pPr>
+    </w:lvl>
+  </w:abstractNum>
+  <w:abstractNum w:abstractNumId="14" w15:restartNumberingAfterBreak="0">
+    <w:nsid w:val="23A3702D"/>
+    <w:multiLevelType w:val="multilevel"/>
+    <w:tmpl w:val="A254EF3C"/>
+    <w:lvl w:ilvl="0">
+      <w:start w:val="1"/>
+      <w:numFmt w:val="decimal"/>
+      <w:lvlText w:val="%1."/>
+      <w:lvlJc w:val="left"/>
+      <w:pPr>
+        <w:tabs>
+          <w:tab w:val="num" w:pos="720"/>
+        </w:tabs>
+        <w:ind w:left="720" w:hanging="360"/>
+      </w:pPr>
+    </w:lvl>
+    <w:lvl w:ilvl="1" w:tentative="1">
+      <w:start w:val="1"/>
+      <w:numFmt w:val="decimal"/>
+      <w:lvlText w:val="%2."/>
+      <w:lvlJc w:val="left"/>
+      <w:pPr>
+        <w:tabs>
+          <w:tab w:val="num" w:pos="1440"/>
+        </w:tabs>
+        <w:ind w:left="1440" w:hanging="360"/>
+      </w:pPr>
+    </w:lvl>
+    <w:lvl w:ilvl="2" w:tentative="1">
+      <w:start w:val="1"/>
+      <w:numFmt w:val="decimal"/>
+      <w:lvlText w:val="%3."/>
+      <w:lvlJc w:val="left"/>
+      <w:pPr>
+        <w:tabs>
+          <w:tab w:val="num" w:pos="2160"/>
+        </w:tabs>
+        <w:ind w:left="2160" w:hanging="360"/>
+      </w:pPr>
+    </w:lvl>
+    <w:lvl w:ilvl="3" w:tentative="1">
+      <w:start w:val="1"/>
+      <w:numFmt w:val="decimal"/>
+      <w:lvlText w:val="%4."/>
+      <w:lvlJc w:val="left"/>
+      <w:pPr>
+        <w:tabs>
+          <w:tab w:val="num" w:pos="2880"/>
+        </w:tabs>
+        <w:ind w:left="2880" w:hanging="360"/>
+      </w:pPr>
+    </w:lvl>
+    <w:lvl w:ilvl="4" w:tentative="1">
+      <w:start w:val="1"/>
+      <w:numFmt w:val="decimal"/>
+      <w:lvlText w:val="%5."/>
+      <w:lvlJc w:val="left"/>
+      <w:pPr>
+        <w:tabs>
+          <w:tab w:val="num" w:pos="3600"/>
+        </w:tabs>
+        <w:ind w:left="3600" w:hanging="360"/>
+      </w:pPr>
+    </w:lvl>
+    <w:lvl w:ilvl="5" w:tentative="1">
+      <w:start w:val="1"/>
+      <w:numFmt w:val="decimal"/>
+      <w:lvlText w:val="%6."/>
+      <w:lvlJc w:val="left"/>
+      <w:pPr>
+        <w:tabs>
+          <w:tab w:val="num" w:pos="4320"/>
+        </w:tabs>
+        <w:ind w:left="4320" w:hanging="360"/>
+      </w:pPr>
+    </w:lvl>
+    <w:lvl w:ilvl="6" w:tentative="1">
+      <w:start w:val="1"/>
+      <w:numFmt w:val="decimal"/>
+      <w:lvlText w:val="%7."/>
+      <w:lvlJc w:val="left"/>
+      <w:pPr>
+        <w:tabs>
+          <w:tab w:val="num" w:pos="5040"/>
+        </w:tabs>
+        <w:ind w:left="5040" w:hanging="360"/>
+      </w:pPr>
+    </w:lvl>
+    <w:lvl w:ilvl="7" w:tentative="1">
+      <w:start w:val="1"/>
+      <w:numFmt w:val="decimal"/>
+      <w:lvlText w:val="%8."/>
+      <w:lvlJc w:val="left"/>
+      <w:pPr>
+        <w:tabs>
+          <w:tab w:val="num" w:pos="5760"/>
+        </w:tabs>
+        <w:ind w:left="5760" w:hanging="360"/>
+      </w:pPr>
+    </w:lvl>
+    <w:lvl w:ilvl="8" w:tentative="1">
+      <w:start w:val="1"/>
+      <w:numFmt w:val="decimal"/>
+      <w:lvlText w:val="%9."/>
+      <w:lvlJc w:val="left"/>
+      <w:pPr>
+        <w:tabs>
+          <w:tab w:val="num" w:pos="6480"/>
+        </w:tabs>
+        <w:ind w:left="6480" w:hanging="360"/>
+      </w:pPr>
+    </w:lvl>
+  </w:abstractNum>
+  <w:abstractNum w:abstractNumId="15" w15:restartNumberingAfterBreak="0">
+    <w:nsid w:val="2C834957"/>
+    <w:multiLevelType w:val="hybridMultilevel"/>
+    <w:tmpl w:val="69FA0142"/>
+    <w:lvl w:ilvl="0" w:tplc="FFFFFFFF">
+      <w:start w:val="1"/>
+      <w:numFmt w:val="upperLetter"/>
+      <w:lvlText w:val="%1."/>
+      <w:lvlJc w:val="left"/>
+      <w:pPr>
+        <w:ind w:left="720" w:hanging="360"/>
+      </w:pPr>
+    </w:lvl>
+    <w:lvl w:ilvl="1" w:tplc="FFFFFFFF" w:tentative="1">
+      <w:start w:val="1"/>
+      <w:numFmt w:val="lowerLetter"/>
+      <w:lvlText w:val="%2."/>
+      <w:lvlJc w:val="left"/>
+      <w:pPr>
+        <w:ind w:left="1440" w:hanging="360"/>
+      </w:pPr>
+    </w:lvl>
+    <w:lvl w:ilvl="2" w:tplc="FFFFFFFF" w:tentative="1">
+      <w:start w:val="1"/>
+      <w:numFmt w:val="lowerRoman"/>
+      <w:lvlText w:val="%3."/>
+      <w:lvlJc w:val="right"/>
+      <w:pPr>
+        <w:ind w:left="2160" w:hanging="180"/>
+      </w:pPr>
+    </w:lvl>
+    <w:lvl w:ilvl="3" w:tplc="FFFFFFFF" w:tentative="1">
+      <w:start w:val="1"/>
+      <w:numFmt w:val="decimal"/>
+      <w:lvlText w:val="%4."/>
+      <w:lvlJc w:val="left"/>
+      <w:pPr>
+        <w:ind w:left="2880" w:hanging="360"/>
+      </w:pPr>
+    </w:lvl>
+    <w:lvl w:ilvl="4" w:tplc="FFFFFFFF" w:tentative="1">
+      <w:start w:val="1"/>
+      <w:numFmt w:val="lowerLetter"/>
+      <w:lvlText w:val="%5."/>
+      <w:lvlJc w:val="left"/>
+      <w:pPr>
+        <w:ind w:left="3600" w:hanging="360"/>
+      </w:pPr>
+    </w:lvl>
+    <w:lvl w:ilvl="5" w:tplc="FFFFFFFF" w:tentative="1">
+      <w:start w:val="1"/>
+      <w:numFmt w:val="lowerRoman"/>
+      <w:lvlText w:val="%6."/>
+      <w:lvlJc w:val="right"/>
+      <w:pPr>
+        <w:ind w:left="4320" w:hanging="180"/>
+      </w:pPr>
+    </w:lvl>
+    <w:lvl w:ilvl="6" w:tplc="FFFFFFFF" w:tentative="1">
+      <w:start w:val="1"/>
+      <w:numFmt w:val="decimal"/>
+      <w:lvlText w:val="%7."/>
+      <w:lvlJc w:val="left"/>
+      <w:pPr>
+        <w:ind w:left="5040" w:hanging="360"/>
+      </w:pPr>
+    </w:lvl>
+    <w:lvl w:ilvl="7" w:tplc="FFFFFFFF" w:tentative="1">
+      <w:start w:val="1"/>
+      <w:numFmt w:val="lowerLetter"/>
+      <w:lvlText w:val="%8."/>
+      <w:lvlJc w:val="left"/>
+      <w:pPr>
+        <w:ind w:left="5760" w:hanging="360"/>
+      </w:pPr>
+    </w:lvl>
+    <w:lvl w:ilvl="8" w:tplc="FFFFFFFF" w:tentative="1">
+      <w:start w:val="1"/>
+      <w:numFmt w:val="lowerRoman"/>
+      <w:lvlText w:val="%9."/>
+      <w:lvlJc w:val="right"/>
+      <w:pPr>
+        <w:ind w:left="6480" w:hanging="180"/>
+      </w:pPr>
+    </w:lvl>
+  </w:abstractNum>
+  <w:abstractNum w:abstractNumId="16" w15:restartNumberingAfterBreak="0">
+    <w:nsid w:val="3ECE24E2"/>
+    <w:multiLevelType w:val="multilevel"/>
+    <w:tmpl w:val="0409001D"/>
+    <w:lvl w:ilvl="0">
+      <w:start w:val="1"/>
+      <w:numFmt w:val="decimal"/>
+      <w:lvlText w:val="%1)"/>
+      <w:lvlJc w:val="left"/>
+      <w:pPr>
+        <w:ind w:left="360" w:hanging="360"/>
+      </w:pPr>
+    </w:lvl>
+    <w:lvl w:ilvl="1">
+      <w:start w:val="1"/>
+      <w:numFmt w:val="lowerLetter"/>
+      <w:lvlText w:val="%2)"/>
+      <w:lvlJc w:val="left"/>
+      <w:pPr>
+        <w:ind w:left="720" w:hanging="360"/>
+      </w:pPr>
+    </w:lvl>
+    <w:lvl w:ilvl="2">
+      <w:start w:val="1"/>
+      <w:numFmt w:val="lowerRoman"/>
+      <w:lvlText w:val="%3)"/>
+      <w:lvlJc w:val="left"/>
+      <w:pPr>
+        <w:ind w:left="1080" w:hanging="360"/>
+      </w:pPr>
+    </w:lvl>
+    <w:lvl w:ilvl="3">
+      <w:start w:val="1"/>
+      <w:numFmt w:val="decimal"/>
+      <w:lvlText w:val="(%4)"/>
+      <w:lvlJc w:val="left"/>
+      <w:pPr>
+        <w:ind w:left="1440" w:hanging="360"/>
+      </w:pPr>
+    </w:lvl>
+    <w:lvl w:ilvl="4">
+      <w:start w:val="1"/>
+      <w:numFmt w:val="lowerLetter"/>
+      <w:lvlText w:val="(%5)"/>
+      <w:lvlJc w:val="left"/>
+      <w:pPr>
+        <w:ind w:left="1800" w:hanging="360"/>
+      </w:pPr>
+    </w:lvl>
+    <w:lvl w:ilvl="5">
+      <w:start w:val="1"/>
+      <w:numFmt w:val="lowerRoman"/>
+      <w:lvlText w:val="(%6)"/>
+      <w:lvlJc w:val="left"/>
+      <w:pPr>
+        <w:ind w:left="2160" w:hanging="360"/>
+      </w:pPr>
+    </w:lvl>
+    <w:lvl w:ilvl="6">
+      <w:start w:val="1"/>
+      <w:numFmt w:val="decimal"/>
+      <w:lvlText w:val="%7."/>
+      <w:lvlJc w:val="left"/>
+      <w:pPr>
+        <w:ind w:left="2520" w:hanging="360"/>
+      </w:pPr>
+    </w:lvl>
+    <w:lvl w:ilvl="7">
+      <w:start w:val="1"/>
+      <w:numFmt w:val="lowerLetter"/>
+      <w:lvlText w:val="%8."/>
+      <w:lvlJc w:val="left"/>
+      <w:pPr>
+        <w:ind w:left="2880" w:hanging="360"/>
+      </w:pPr>
+    </w:lvl>
+    <w:lvl w:ilvl="8">
+      <w:start w:val="1"/>
+      <w:numFmt w:val="lowerRoman"/>
+      <w:lvlText w:val="%9."/>
+      <w:lvlJc w:val="left"/>
+      <w:pPr>
+        <w:ind w:left="3240" w:hanging="360"/>
+      </w:pPr>
+    </w:lvl>
+  </w:abstractNum>
+  <w:abstractNum w:abstractNumId="17" w15:restartNumberingAfterBreak="0">
+    <w:nsid w:val="43345EBB"/>
+    <w:multiLevelType w:val="hybridMultilevel"/>
+    <w:tmpl w:val="E1283EE2"/>
+    <w:lvl w:ilvl="0" w:tplc="D1F67A94">
+      <w:start w:val="5"/>
+      <w:numFmt w:val="upperLetter"/>
+      <w:lvlText w:val="%1."/>
+      <w:lvlJc w:val="left"/>
+      <w:pPr>
+        <w:tabs>
+          <w:tab w:val="num" w:pos="720"/>
+        </w:tabs>
+        <w:ind w:left="720" w:hanging="360"/>
+      </w:pPr>
+    </w:lvl>
+    <w:lvl w:ilvl="1" w:tplc="24228504" w:tentative="1">
+      <w:start w:val="1"/>
+      <w:numFmt w:val="decimal"/>
+      <w:lvlText w:val="%2."/>
+      <w:lvlJc w:val="left"/>
+      <w:pPr>
+        <w:tabs>
+          <w:tab w:val="num" w:pos="1440"/>
+        </w:tabs>
+        <w:ind w:left="1440" w:hanging="360"/>
+      </w:pPr>
+    </w:lvl>
+    <w:lvl w:ilvl="2" w:tplc="64A2030E" w:tentative="1">
+      <w:start w:val="1"/>
+      <w:numFmt w:val="decimal"/>
+      <w:lvlText w:val="%3."/>
+      <w:lvlJc w:val="left"/>
+      <w:pPr>
+        <w:tabs>
+          <w:tab w:val="num" w:pos="2160"/>
+        </w:tabs>
+        <w:ind w:left="2160" w:hanging="360"/>
+      </w:pPr>
+    </w:lvl>
+    <w:lvl w:ilvl="3" w:tplc="9904A0E2" w:tentative="1">
+      <w:start w:val="1"/>
+      <w:numFmt w:val="decimal"/>
+      <w:lvlText w:val="%4."/>
+      <w:lvlJc w:val="left"/>
+      <w:pPr>
+        <w:tabs>
+          <w:tab w:val="num" w:pos="2880"/>
+        </w:tabs>
+        <w:ind w:left="2880" w:hanging="360"/>
+      </w:pPr>
+    </w:lvl>
+    <w:lvl w:ilvl="4" w:tplc="8EBC60BE" w:tentative="1">
+      <w:start w:val="1"/>
+      <w:numFmt w:val="decimal"/>
+      <w:lvlText w:val="%5."/>
+      <w:lvlJc w:val="left"/>
+      <w:pPr>
+        <w:tabs>
+          <w:tab w:val="num" w:pos="3600"/>
+        </w:tabs>
+        <w:ind w:left="3600" w:hanging="360"/>
+      </w:pPr>
+    </w:lvl>
+    <w:lvl w:ilvl="5" w:tplc="F36029F2" w:tentative="1">
+      <w:start w:val="1"/>
+      <w:numFmt w:val="decimal"/>
+      <w:lvlText w:val="%6."/>
+      <w:lvlJc w:val="left"/>
+      <w:pPr>
+        <w:tabs>
+          <w:tab w:val="num" w:pos="4320"/>
+        </w:tabs>
+        <w:ind w:left="4320" w:hanging="360"/>
+      </w:pPr>
+    </w:lvl>
+    <w:lvl w:ilvl="6" w:tplc="8D321B58" w:tentative="1">
+      <w:start w:val="1"/>
+      <w:numFmt w:val="decimal"/>
+      <w:lvlText w:val="%7."/>
+      <w:lvlJc w:val="left"/>
+      <w:pPr>
+        <w:tabs>
+          <w:tab w:val="num" w:pos="5040"/>
+        </w:tabs>
+        <w:ind w:left="5040" w:hanging="360"/>
+      </w:pPr>
+    </w:lvl>
+    <w:lvl w:ilvl="7" w:tplc="58F8927C" w:tentative="1">
+      <w:start w:val="1"/>
+      <w:numFmt w:val="decimal"/>
+      <w:lvlText w:val="%8."/>
+      <w:lvlJc w:val="left"/>
+      <w:pPr>
+        <w:tabs>
+          <w:tab w:val="num" w:pos="5760"/>
+        </w:tabs>
+        <w:ind w:left="5760" w:hanging="360"/>
+      </w:pPr>
+    </w:lvl>
+    <w:lvl w:ilvl="8" w:tplc="3CF4A60A" w:tentative="1">
+      <w:start w:val="1"/>
+      <w:numFmt w:val="decimal"/>
+      <w:lvlText w:val="%9."/>
+      <w:lvlJc w:val="left"/>
+      <w:pPr>
+        <w:tabs>
+          <w:tab w:val="num" w:pos="6480"/>
+        </w:tabs>
+        <w:ind w:left="6480" w:hanging="360"/>
+      </w:pPr>
+    </w:lvl>
+  </w:abstractNum>
+  <w:abstractNum w:abstractNumId="18" w15:restartNumberingAfterBreak="0">
     <w:nsid w:val="44761870"/>
     <w:multiLevelType w:val="multilevel"/>
     <w:tmpl w:val="69CC0FA2"/>
@@ -2901,7 +3600,7 @@
       </w:rPr>
     </w:lvl>
   </w:abstractNum>
-  <w:abstractNum w:abstractNumId="11" w15:restartNumberingAfterBreak="0">
+  <w:abstractNum w:abstractNumId="19" w15:restartNumberingAfterBreak="0">
     <w:nsid w:val="463F2D93"/>
     <w:multiLevelType w:val="multilevel"/>
     <w:tmpl w:val="5C32657A"/>
@@ -3050,7 +3749,572 @@
       </w:rPr>
     </w:lvl>
   </w:abstractNum>
-  <w:abstractNum w:abstractNumId="12" w15:restartNumberingAfterBreak="0">
+  <w:abstractNum w:abstractNumId="20" w15:restartNumberingAfterBreak="0">
+    <w:nsid w:val="4C3E187D"/>
+    <w:multiLevelType w:val="hybridMultilevel"/>
+    <w:tmpl w:val="3CA618EC"/>
+    <w:lvl w:ilvl="0" w:tplc="5E984580">
+      <w:start w:val="5"/>
+      <w:numFmt w:val="upperLetter"/>
+      <w:lvlText w:val="%1."/>
+      <w:lvlJc w:val="left"/>
+      <w:pPr>
+        <w:tabs>
+          <w:tab w:val="num" w:pos="720"/>
+        </w:tabs>
+        <w:ind w:left="720" w:hanging="360"/>
+      </w:pPr>
+    </w:lvl>
+    <w:lvl w:ilvl="1" w:tplc="A3F217E0" w:tentative="1">
+      <w:start w:val="1"/>
+      <w:numFmt w:val="decimal"/>
+      <w:lvlText w:val="%2."/>
+      <w:lvlJc w:val="left"/>
+      <w:pPr>
+        <w:tabs>
+          <w:tab w:val="num" w:pos="1440"/>
+        </w:tabs>
+        <w:ind w:left="1440" w:hanging="360"/>
+      </w:pPr>
+    </w:lvl>
+    <w:lvl w:ilvl="2" w:tplc="3B020D30" w:tentative="1">
+      <w:start w:val="1"/>
+      <w:numFmt w:val="decimal"/>
+      <w:lvlText w:val="%3."/>
+      <w:lvlJc w:val="left"/>
+      <w:pPr>
+        <w:tabs>
+          <w:tab w:val="num" w:pos="2160"/>
+        </w:tabs>
+        <w:ind w:left="2160" w:hanging="360"/>
+      </w:pPr>
+    </w:lvl>
+    <w:lvl w:ilvl="3" w:tplc="59DA540E" w:tentative="1">
+      <w:start w:val="1"/>
+      <w:numFmt w:val="decimal"/>
+      <w:lvlText w:val="%4."/>
+      <w:lvlJc w:val="left"/>
+      <w:pPr>
+        <w:tabs>
+          <w:tab w:val="num" w:pos="2880"/>
+        </w:tabs>
+        <w:ind w:left="2880" w:hanging="360"/>
+      </w:pPr>
+    </w:lvl>
+    <w:lvl w:ilvl="4" w:tplc="2CB207AA" w:tentative="1">
+      <w:start w:val="1"/>
+      <w:numFmt w:val="decimal"/>
+      <w:lvlText w:val="%5."/>
+      <w:lvlJc w:val="left"/>
+      <w:pPr>
+        <w:tabs>
+          <w:tab w:val="num" w:pos="3600"/>
+        </w:tabs>
+        <w:ind w:left="3600" w:hanging="360"/>
+      </w:pPr>
+    </w:lvl>
+    <w:lvl w:ilvl="5" w:tplc="7B42F576" w:tentative="1">
+      <w:start w:val="1"/>
+      <w:numFmt w:val="decimal"/>
+      <w:lvlText w:val="%6."/>
+      <w:lvlJc w:val="left"/>
+      <w:pPr>
+        <w:tabs>
+          <w:tab w:val="num" w:pos="4320"/>
+        </w:tabs>
+        <w:ind w:left="4320" w:hanging="360"/>
+      </w:pPr>
+    </w:lvl>
+    <w:lvl w:ilvl="6" w:tplc="74A8C27A" w:tentative="1">
+      <w:start w:val="1"/>
+      <w:numFmt w:val="decimal"/>
+      <w:lvlText w:val="%7."/>
+      <w:lvlJc w:val="left"/>
+      <w:pPr>
+        <w:tabs>
+          <w:tab w:val="num" w:pos="5040"/>
+        </w:tabs>
+        <w:ind w:left="5040" w:hanging="360"/>
+      </w:pPr>
+    </w:lvl>
+    <w:lvl w:ilvl="7" w:tplc="4AD8A476" w:tentative="1">
+      <w:start w:val="1"/>
+      <w:numFmt w:val="decimal"/>
+      <w:lvlText w:val="%8."/>
+      <w:lvlJc w:val="left"/>
+      <w:pPr>
+        <w:tabs>
+          <w:tab w:val="num" w:pos="5760"/>
+        </w:tabs>
+        <w:ind w:left="5760" w:hanging="360"/>
+      </w:pPr>
+    </w:lvl>
+    <w:lvl w:ilvl="8" w:tplc="E892ED80" w:tentative="1">
+      <w:start w:val="1"/>
+      <w:numFmt w:val="decimal"/>
+      <w:lvlText w:val="%9."/>
+      <w:lvlJc w:val="left"/>
+      <w:pPr>
+        <w:tabs>
+          <w:tab w:val="num" w:pos="6480"/>
+        </w:tabs>
+        <w:ind w:left="6480" w:hanging="360"/>
+      </w:pPr>
+    </w:lvl>
+  </w:abstractNum>
+  <w:abstractNum w:abstractNumId="21" w15:restartNumberingAfterBreak="0">
+    <w:nsid w:val="4DF97F0E"/>
+    <w:multiLevelType w:val="hybridMultilevel"/>
+    <w:tmpl w:val="0930F5AE"/>
+    <w:lvl w:ilvl="0" w:tplc="B8647368">
+      <w:start w:val="3"/>
+      <w:numFmt w:val="upperRoman"/>
+      <w:lvlText w:val="%1."/>
+      <w:lvlJc w:val="right"/>
+      <w:pPr>
+        <w:tabs>
+          <w:tab w:val="num" w:pos="720"/>
+        </w:tabs>
+        <w:ind w:left="720" w:hanging="360"/>
+      </w:pPr>
+    </w:lvl>
+    <w:lvl w:ilvl="1" w:tplc="C122AE72" w:tentative="1">
+      <w:start w:val="1"/>
+      <w:numFmt w:val="decimal"/>
+      <w:lvlText w:val="%2."/>
+      <w:lvlJc w:val="left"/>
+      <w:pPr>
+        <w:tabs>
+          <w:tab w:val="num" w:pos="1440"/>
+        </w:tabs>
+        <w:ind w:left="1440" w:hanging="360"/>
+      </w:pPr>
+    </w:lvl>
+    <w:lvl w:ilvl="2" w:tplc="E83253F6" w:tentative="1">
+      <w:start w:val="1"/>
+      <w:numFmt w:val="decimal"/>
+      <w:lvlText w:val="%3."/>
+      <w:lvlJc w:val="left"/>
+      <w:pPr>
+        <w:tabs>
+          <w:tab w:val="num" w:pos="2160"/>
+        </w:tabs>
+        <w:ind w:left="2160" w:hanging="360"/>
+      </w:pPr>
+    </w:lvl>
+    <w:lvl w:ilvl="3" w:tplc="74AA2114" w:tentative="1">
+      <w:start w:val="1"/>
+      <w:numFmt w:val="decimal"/>
+      <w:lvlText w:val="%4."/>
+      <w:lvlJc w:val="left"/>
+      <w:pPr>
+        <w:tabs>
+          <w:tab w:val="num" w:pos="2880"/>
+        </w:tabs>
+        <w:ind w:left="2880" w:hanging="360"/>
+      </w:pPr>
+    </w:lvl>
+    <w:lvl w:ilvl="4" w:tplc="53DCB4A8" w:tentative="1">
+      <w:start w:val="1"/>
+      <w:numFmt w:val="decimal"/>
+      <w:lvlText w:val="%5."/>
+      <w:lvlJc w:val="left"/>
+      <w:pPr>
+        <w:tabs>
+          <w:tab w:val="num" w:pos="3600"/>
+        </w:tabs>
+        <w:ind w:left="3600" w:hanging="360"/>
+      </w:pPr>
+    </w:lvl>
+    <w:lvl w:ilvl="5" w:tplc="30348186" w:tentative="1">
+      <w:start w:val="1"/>
+      <w:numFmt w:val="decimal"/>
+      <w:lvlText w:val="%6."/>
+      <w:lvlJc w:val="left"/>
+      <w:pPr>
+        <w:tabs>
+          <w:tab w:val="num" w:pos="4320"/>
+        </w:tabs>
+        <w:ind w:left="4320" w:hanging="360"/>
+      </w:pPr>
+    </w:lvl>
+    <w:lvl w:ilvl="6" w:tplc="8DCE8672" w:tentative="1">
+      <w:start w:val="1"/>
+      <w:numFmt w:val="decimal"/>
+      <w:lvlText w:val="%7."/>
+      <w:lvlJc w:val="left"/>
+      <w:pPr>
+        <w:tabs>
+          <w:tab w:val="num" w:pos="5040"/>
+        </w:tabs>
+        <w:ind w:left="5040" w:hanging="360"/>
+      </w:pPr>
+    </w:lvl>
+    <w:lvl w:ilvl="7" w:tplc="5EB0E920" w:tentative="1">
+      <w:start w:val="1"/>
+      <w:numFmt w:val="decimal"/>
+      <w:lvlText w:val="%8."/>
+      <w:lvlJc w:val="left"/>
+      <w:pPr>
+        <w:tabs>
+          <w:tab w:val="num" w:pos="5760"/>
+        </w:tabs>
+        <w:ind w:left="5760" w:hanging="360"/>
+      </w:pPr>
+    </w:lvl>
+    <w:lvl w:ilvl="8" w:tplc="16AC20FE" w:tentative="1">
+      <w:start w:val="1"/>
+      <w:numFmt w:val="decimal"/>
+      <w:lvlText w:val="%9."/>
+      <w:lvlJc w:val="left"/>
+      <w:pPr>
+        <w:tabs>
+          <w:tab w:val="num" w:pos="6480"/>
+        </w:tabs>
+        <w:ind w:left="6480" w:hanging="360"/>
+      </w:pPr>
+    </w:lvl>
+  </w:abstractNum>
+  <w:abstractNum w:abstractNumId="22" w15:restartNumberingAfterBreak="0">
+    <w:nsid w:val="512A0287"/>
+    <w:multiLevelType w:val="hybridMultilevel"/>
+    <w:tmpl w:val="5394C46E"/>
+    <w:lvl w:ilvl="0" w:tplc="30884280">
+      <w:start w:val="2"/>
+      <w:numFmt w:val="upperLetter"/>
+      <w:lvlText w:val="%1."/>
+      <w:lvlJc w:val="left"/>
+      <w:pPr>
+        <w:tabs>
+          <w:tab w:val="num" w:pos="720"/>
+        </w:tabs>
+        <w:ind w:left="720" w:hanging="360"/>
+      </w:pPr>
+    </w:lvl>
+    <w:lvl w:ilvl="1" w:tplc="9618A308" w:tentative="1">
+      <w:start w:val="1"/>
+      <w:numFmt w:val="decimal"/>
+      <w:lvlText w:val="%2."/>
+      <w:lvlJc w:val="left"/>
+      <w:pPr>
+        <w:tabs>
+          <w:tab w:val="num" w:pos="1440"/>
+        </w:tabs>
+        <w:ind w:left="1440" w:hanging="360"/>
+      </w:pPr>
+    </w:lvl>
+    <w:lvl w:ilvl="2" w:tplc="0406B6FC" w:tentative="1">
+      <w:start w:val="1"/>
+      <w:numFmt w:val="decimal"/>
+      <w:lvlText w:val="%3."/>
+      <w:lvlJc w:val="left"/>
+      <w:pPr>
+        <w:tabs>
+          <w:tab w:val="num" w:pos="2160"/>
+        </w:tabs>
+        <w:ind w:left="2160" w:hanging="360"/>
+      </w:pPr>
+    </w:lvl>
+    <w:lvl w:ilvl="3" w:tplc="98268AA4" w:tentative="1">
+      <w:start w:val="1"/>
+      <w:numFmt w:val="decimal"/>
+      <w:lvlText w:val="%4."/>
+      <w:lvlJc w:val="left"/>
+      <w:pPr>
+        <w:tabs>
+          <w:tab w:val="num" w:pos="2880"/>
+        </w:tabs>
+        <w:ind w:left="2880" w:hanging="360"/>
+      </w:pPr>
+    </w:lvl>
+    <w:lvl w:ilvl="4" w:tplc="38D49C52" w:tentative="1">
+      <w:start w:val="1"/>
+      <w:numFmt w:val="decimal"/>
+      <w:lvlText w:val="%5."/>
+      <w:lvlJc w:val="left"/>
+      <w:pPr>
+        <w:tabs>
+          <w:tab w:val="num" w:pos="3600"/>
+        </w:tabs>
+        <w:ind w:left="3600" w:hanging="360"/>
+      </w:pPr>
+    </w:lvl>
+    <w:lvl w:ilvl="5" w:tplc="9FE8FAE4" w:tentative="1">
+      <w:start w:val="1"/>
+      <w:numFmt w:val="decimal"/>
+      <w:lvlText w:val="%6."/>
+      <w:lvlJc w:val="left"/>
+      <w:pPr>
+        <w:tabs>
+          <w:tab w:val="num" w:pos="4320"/>
+        </w:tabs>
+        <w:ind w:left="4320" w:hanging="360"/>
+      </w:pPr>
+    </w:lvl>
+    <w:lvl w:ilvl="6" w:tplc="B53E91CE" w:tentative="1">
+      <w:start w:val="1"/>
+      <w:numFmt w:val="decimal"/>
+      <w:lvlText w:val="%7."/>
+      <w:lvlJc w:val="left"/>
+      <w:pPr>
+        <w:tabs>
+          <w:tab w:val="num" w:pos="5040"/>
+        </w:tabs>
+        <w:ind w:left="5040" w:hanging="360"/>
+      </w:pPr>
+    </w:lvl>
+    <w:lvl w:ilvl="7" w:tplc="31C01250" w:tentative="1">
+      <w:start w:val="1"/>
+      <w:numFmt w:val="decimal"/>
+      <w:lvlText w:val="%8."/>
+      <w:lvlJc w:val="left"/>
+      <w:pPr>
+        <w:tabs>
+          <w:tab w:val="num" w:pos="5760"/>
+        </w:tabs>
+        <w:ind w:left="5760" w:hanging="360"/>
+      </w:pPr>
+    </w:lvl>
+    <w:lvl w:ilvl="8" w:tplc="017891F0" w:tentative="1">
+      <w:start w:val="1"/>
+      <w:numFmt w:val="decimal"/>
+      <w:lvlText w:val="%9."/>
+      <w:lvlJc w:val="left"/>
+      <w:pPr>
+        <w:tabs>
+          <w:tab w:val="num" w:pos="6480"/>
+        </w:tabs>
+        <w:ind w:left="6480" w:hanging="360"/>
+      </w:pPr>
+    </w:lvl>
+  </w:abstractNum>
+  <w:abstractNum w:abstractNumId="23" w15:restartNumberingAfterBreak="0">
+    <w:nsid w:val="54614635"/>
+    <w:multiLevelType w:val="hybridMultilevel"/>
+    <w:tmpl w:val="5B2E52A6"/>
+    <w:lvl w:ilvl="0" w:tplc="21BEE4EE">
+      <w:start w:val="3"/>
+      <w:numFmt w:val="upperLetter"/>
+      <w:lvlText w:val="%1."/>
+      <w:lvlJc w:val="left"/>
+      <w:pPr>
+        <w:tabs>
+          <w:tab w:val="num" w:pos="720"/>
+        </w:tabs>
+        <w:ind w:left="720" w:hanging="360"/>
+      </w:pPr>
+    </w:lvl>
+    <w:lvl w:ilvl="1" w:tplc="1B10A226" w:tentative="1">
+      <w:start w:val="1"/>
+      <w:numFmt w:val="decimal"/>
+      <w:lvlText w:val="%2."/>
+      <w:lvlJc w:val="left"/>
+      <w:pPr>
+        <w:tabs>
+          <w:tab w:val="num" w:pos="1440"/>
+        </w:tabs>
+        <w:ind w:left="1440" w:hanging="360"/>
+      </w:pPr>
+    </w:lvl>
+    <w:lvl w:ilvl="2" w:tplc="39BC5AEE" w:tentative="1">
+      <w:start w:val="1"/>
+      <w:numFmt w:val="decimal"/>
+      <w:lvlText w:val="%3."/>
+      <w:lvlJc w:val="left"/>
+      <w:pPr>
+        <w:tabs>
+          <w:tab w:val="num" w:pos="2160"/>
+        </w:tabs>
+        <w:ind w:left="2160" w:hanging="360"/>
+      </w:pPr>
+    </w:lvl>
+    <w:lvl w:ilvl="3" w:tplc="EAF8DE82" w:tentative="1">
+      <w:start w:val="1"/>
+      <w:numFmt w:val="decimal"/>
+      <w:lvlText w:val="%4."/>
+      <w:lvlJc w:val="left"/>
+      <w:pPr>
+        <w:tabs>
+          <w:tab w:val="num" w:pos="2880"/>
+        </w:tabs>
+        <w:ind w:left="2880" w:hanging="360"/>
+      </w:pPr>
+    </w:lvl>
+    <w:lvl w:ilvl="4" w:tplc="D068B06A" w:tentative="1">
+      <w:start w:val="1"/>
+      <w:numFmt w:val="decimal"/>
+      <w:lvlText w:val="%5."/>
+      <w:lvlJc w:val="left"/>
+      <w:pPr>
+        <w:tabs>
+          <w:tab w:val="num" w:pos="3600"/>
+        </w:tabs>
+        <w:ind w:left="3600" w:hanging="360"/>
+      </w:pPr>
+    </w:lvl>
+    <w:lvl w:ilvl="5" w:tplc="5442E27C" w:tentative="1">
+      <w:start w:val="1"/>
+      <w:numFmt w:val="decimal"/>
+      <w:lvlText w:val="%6."/>
+      <w:lvlJc w:val="left"/>
+      <w:pPr>
+        <w:tabs>
+          <w:tab w:val="num" w:pos="4320"/>
+        </w:tabs>
+        <w:ind w:left="4320" w:hanging="360"/>
+      </w:pPr>
+    </w:lvl>
+    <w:lvl w:ilvl="6" w:tplc="3C528C16" w:tentative="1">
+      <w:start w:val="1"/>
+      <w:numFmt w:val="decimal"/>
+      <w:lvlText w:val="%7."/>
+      <w:lvlJc w:val="left"/>
+      <w:pPr>
+        <w:tabs>
+          <w:tab w:val="num" w:pos="5040"/>
+        </w:tabs>
+        <w:ind w:left="5040" w:hanging="360"/>
+      </w:pPr>
+    </w:lvl>
+    <w:lvl w:ilvl="7" w:tplc="B56EF13A" w:tentative="1">
+      <w:start w:val="1"/>
+      <w:numFmt w:val="decimal"/>
+      <w:lvlText w:val="%8."/>
+      <w:lvlJc w:val="left"/>
+      <w:pPr>
+        <w:tabs>
+          <w:tab w:val="num" w:pos="5760"/>
+        </w:tabs>
+        <w:ind w:left="5760" w:hanging="360"/>
+      </w:pPr>
+    </w:lvl>
+    <w:lvl w:ilvl="8" w:tplc="C0BC7258" w:tentative="1">
+      <w:start w:val="1"/>
+      <w:numFmt w:val="decimal"/>
+      <w:lvlText w:val="%9."/>
+      <w:lvlJc w:val="left"/>
+      <w:pPr>
+        <w:tabs>
+          <w:tab w:val="num" w:pos="6480"/>
+        </w:tabs>
+        <w:ind w:left="6480" w:hanging="360"/>
+      </w:pPr>
+    </w:lvl>
+  </w:abstractNum>
+  <w:abstractNum w:abstractNumId="24" w15:restartNumberingAfterBreak="0">
+    <w:nsid w:val="5B6039C6"/>
+    <w:multiLevelType w:val="hybridMultilevel"/>
+    <w:tmpl w:val="513E49D8"/>
+    <w:lvl w:ilvl="0" w:tplc="789A47CC">
+      <w:start w:val="4"/>
+      <w:numFmt w:val="upperLetter"/>
+      <w:lvlText w:val="%1."/>
+      <w:lvlJc w:val="left"/>
+      <w:pPr>
+        <w:tabs>
+          <w:tab w:val="num" w:pos="720"/>
+        </w:tabs>
+        <w:ind w:left="720" w:hanging="360"/>
+      </w:pPr>
+    </w:lvl>
+    <w:lvl w:ilvl="1" w:tplc="B51C61D4" w:tentative="1">
+      <w:start w:val="1"/>
+      <w:numFmt w:val="decimal"/>
+      <w:lvlText w:val="%2."/>
+      <w:lvlJc w:val="left"/>
+      <w:pPr>
+        <w:tabs>
+          <w:tab w:val="num" w:pos="1440"/>
+        </w:tabs>
+        <w:ind w:left="1440" w:hanging="360"/>
+      </w:pPr>
+    </w:lvl>
+    <w:lvl w:ilvl="2" w:tplc="8E2E0C9E" w:tentative="1">
+      <w:start w:val="1"/>
+      <w:numFmt w:val="decimal"/>
+      <w:lvlText w:val="%3."/>
+      <w:lvlJc w:val="left"/>
+      <w:pPr>
+        <w:tabs>
+          <w:tab w:val="num" w:pos="2160"/>
+        </w:tabs>
+        <w:ind w:left="2160" w:hanging="360"/>
+      </w:pPr>
+    </w:lvl>
+    <w:lvl w:ilvl="3" w:tplc="6E288242" w:tentative="1">
+      <w:start w:val="1"/>
+      <w:numFmt w:val="decimal"/>
+      <w:lvlText w:val="%4."/>
+      <w:lvlJc w:val="left"/>
+      <w:pPr>
+        <w:tabs>
+          <w:tab w:val="num" w:pos="2880"/>
+        </w:tabs>
+        <w:ind w:left="2880" w:hanging="360"/>
+      </w:pPr>
+    </w:lvl>
+    <w:lvl w:ilvl="4" w:tplc="BD608D34" w:tentative="1">
+      <w:start w:val="1"/>
+      <w:numFmt w:val="decimal"/>
+      <w:lvlText w:val="%5."/>
+      <w:lvlJc w:val="left"/>
+      <w:pPr>
+        <w:tabs>
+          <w:tab w:val="num" w:pos="3600"/>
+        </w:tabs>
+        <w:ind w:left="3600" w:hanging="360"/>
+      </w:pPr>
+    </w:lvl>
+    <w:lvl w:ilvl="5" w:tplc="8CE4A77C" w:tentative="1">
+      <w:start w:val="1"/>
+      <w:numFmt w:val="decimal"/>
+      <w:lvlText w:val="%6."/>
+      <w:lvlJc w:val="left"/>
+      <w:pPr>
+        <w:tabs>
+          <w:tab w:val="num" w:pos="4320"/>
+        </w:tabs>
+        <w:ind w:left="4320" w:hanging="360"/>
+      </w:pPr>
+    </w:lvl>
+    <w:lvl w:ilvl="6" w:tplc="ED66EB02" w:tentative="1">
+      <w:start w:val="1"/>
+      <w:numFmt w:val="decimal"/>
+      <w:lvlText w:val="%7."/>
+      <w:lvlJc w:val="left"/>
+      <w:pPr>
+        <w:tabs>
+          <w:tab w:val="num" w:pos="5040"/>
+        </w:tabs>
+        <w:ind w:left="5040" w:hanging="360"/>
+      </w:pPr>
+    </w:lvl>
+    <w:lvl w:ilvl="7" w:tplc="6A7EEEE8" w:tentative="1">
+      <w:start w:val="1"/>
+      <w:numFmt w:val="decimal"/>
+      <w:lvlText w:val="%8."/>
+      <w:lvlJc w:val="left"/>
+      <w:pPr>
+        <w:tabs>
+          <w:tab w:val="num" w:pos="5760"/>
+        </w:tabs>
+        <w:ind w:left="5760" w:hanging="360"/>
+      </w:pPr>
+    </w:lvl>
+    <w:lvl w:ilvl="8" w:tplc="C5DAF540" w:tentative="1">
+      <w:start w:val="1"/>
+      <w:numFmt w:val="decimal"/>
+      <w:lvlText w:val="%9."/>
+      <w:lvlJc w:val="left"/>
+      <w:pPr>
+        <w:tabs>
+          <w:tab w:val="num" w:pos="6480"/>
+        </w:tabs>
+        <w:ind w:left="6480" w:hanging="360"/>
+      </w:pPr>
+    </w:lvl>
+  </w:abstractNum>
+  <w:abstractNum w:abstractNumId="25" w15:restartNumberingAfterBreak="0">
     <w:nsid w:val="66CF5884"/>
     <w:multiLevelType w:val="hybridMultilevel"/>
     <w:tmpl w:val="080E526E"/>
@@ -3163,7 +4427,233 @@
       </w:rPr>
     </w:lvl>
   </w:abstractNum>
-  <w:abstractNum w:abstractNumId="13" w15:restartNumberingAfterBreak="0">
+  <w:abstractNum w:abstractNumId="26" w15:restartNumberingAfterBreak="0">
+    <w:nsid w:val="6EC66668"/>
+    <w:multiLevelType w:val="hybridMultilevel"/>
+    <w:tmpl w:val="E692143E"/>
+    <w:lvl w:ilvl="0" w:tplc="0B2CF80C">
+      <w:start w:val="4"/>
+      <w:numFmt w:val="upperRoman"/>
+      <w:lvlText w:val="%1."/>
+      <w:lvlJc w:val="right"/>
+      <w:pPr>
+        <w:tabs>
+          <w:tab w:val="num" w:pos="720"/>
+        </w:tabs>
+        <w:ind w:left="720" w:hanging="360"/>
+      </w:pPr>
+    </w:lvl>
+    <w:lvl w:ilvl="1" w:tplc="A5E0F9F0" w:tentative="1">
+      <w:start w:val="1"/>
+      <w:numFmt w:val="decimal"/>
+      <w:lvlText w:val="%2."/>
+      <w:lvlJc w:val="left"/>
+      <w:pPr>
+        <w:tabs>
+          <w:tab w:val="num" w:pos="1440"/>
+        </w:tabs>
+        <w:ind w:left="1440" w:hanging="360"/>
+      </w:pPr>
+    </w:lvl>
+    <w:lvl w:ilvl="2" w:tplc="15AEF5FE" w:tentative="1">
+      <w:start w:val="1"/>
+      <w:numFmt w:val="decimal"/>
+      <w:lvlText w:val="%3."/>
+      <w:lvlJc w:val="left"/>
+      <w:pPr>
+        <w:tabs>
+          <w:tab w:val="num" w:pos="2160"/>
+        </w:tabs>
+        <w:ind w:left="2160" w:hanging="360"/>
+      </w:pPr>
+    </w:lvl>
+    <w:lvl w:ilvl="3" w:tplc="A920B758" w:tentative="1">
+      <w:start w:val="1"/>
+      <w:numFmt w:val="decimal"/>
+      <w:lvlText w:val="%4."/>
+      <w:lvlJc w:val="left"/>
+      <w:pPr>
+        <w:tabs>
+          <w:tab w:val="num" w:pos="2880"/>
+        </w:tabs>
+        <w:ind w:left="2880" w:hanging="360"/>
+      </w:pPr>
+    </w:lvl>
+    <w:lvl w:ilvl="4" w:tplc="1C425828" w:tentative="1">
+      <w:start w:val="1"/>
+      <w:numFmt w:val="decimal"/>
+      <w:lvlText w:val="%5."/>
+      <w:lvlJc w:val="left"/>
+      <w:pPr>
+        <w:tabs>
+          <w:tab w:val="num" w:pos="3600"/>
+        </w:tabs>
+        <w:ind w:left="3600" w:hanging="360"/>
+      </w:pPr>
+    </w:lvl>
+    <w:lvl w:ilvl="5" w:tplc="87F8ACC8" w:tentative="1">
+      <w:start w:val="1"/>
+      <w:numFmt w:val="decimal"/>
+      <w:lvlText w:val="%6."/>
+      <w:lvlJc w:val="left"/>
+      <w:pPr>
+        <w:tabs>
+          <w:tab w:val="num" w:pos="4320"/>
+        </w:tabs>
+        <w:ind w:left="4320" w:hanging="360"/>
+      </w:pPr>
+    </w:lvl>
+    <w:lvl w:ilvl="6" w:tplc="1640EEF2" w:tentative="1">
+      <w:start w:val="1"/>
+      <w:numFmt w:val="decimal"/>
+      <w:lvlText w:val="%7."/>
+      <w:lvlJc w:val="left"/>
+      <w:pPr>
+        <w:tabs>
+          <w:tab w:val="num" w:pos="5040"/>
+        </w:tabs>
+        <w:ind w:left="5040" w:hanging="360"/>
+      </w:pPr>
+    </w:lvl>
+    <w:lvl w:ilvl="7" w:tplc="6098390C" w:tentative="1">
+      <w:start w:val="1"/>
+      <w:numFmt w:val="decimal"/>
+      <w:lvlText w:val="%8."/>
+      <w:lvlJc w:val="left"/>
+      <w:pPr>
+        <w:tabs>
+          <w:tab w:val="num" w:pos="5760"/>
+        </w:tabs>
+        <w:ind w:left="5760" w:hanging="360"/>
+      </w:pPr>
+    </w:lvl>
+    <w:lvl w:ilvl="8" w:tplc="D0EA5418" w:tentative="1">
+      <w:start w:val="1"/>
+      <w:numFmt w:val="decimal"/>
+      <w:lvlText w:val="%9."/>
+      <w:lvlJc w:val="left"/>
+      <w:pPr>
+        <w:tabs>
+          <w:tab w:val="num" w:pos="6480"/>
+        </w:tabs>
+        <w:ind w:left="6480" w:hanging="360"/>
+      </w:pPr>
+    </w:lvl>
+  </w:abstractNum>
+  <w:abstractNum w:abstractNumId="27" w15:restartNumberingAfterBreak="0">
+    <w:nsid w:val="7955760D"/>
+    <w:multiLevelType w:val="hybridMultilevel"/>
+    <w:tmpl w:val="25BCF424"/>
+    <w:lvl w:ilvl="0" w:tplc="94BEE964">
+      <w:start w:val="4"/>
+      <w:numFmt w:val="upperLetter"/>
+      <w:lvlText w:val="%1."/>
+      <w:lvlJc w:val="left"/>
+      <w:pPr>
+        <w:tabs>
+          <w:tab w:val="num" w:pos="720"/>
+        </w:tabs>
+        <w:ind w:left="720" w:hanging="360"/>
+      </w:pPr>
+    </w:lvl>
+    <w:lvl w:ilvl="1" w:tplc="2266173E" w:tentative="1">
+      <w:start w:val="1"/>
+      <w:numFmt w:val="decimal"/>
+      <w:lvlText w:val="%2."/>
+      <w:lvlJc w:val="left"/>
+      <w:pPr>
+        <w:tabs>
+          <w:tab w:val="num" w:pos="1440"/>
+        </w:tabs>
+        <w:ind w:left="1440" w:hanging="360"/>
+      </w:pPr>
+    </w:lvl>
+    <w:lvl w:ilvl="2" w:tplc="EA403302" w:tentative="1">
+      <w:start w:val="1"/>
+      <w:numFmt w:val="decimal"/>
+      <w:lvlText w:val="%3."/>
+      <w:lvlJc w:val="left"/>
+      <w:pPr>
+        <w:tabs>
+          <w:tab w:val="num" w:pos="2160"/>
+        </w:tabs>
+        <w:ind w:left="2160" w:hanging="360"/>
+      </w:pPr>
+    </w:lvl>
+    <w:lvl w:ilvl="3" w:tplc="2B08208E" w:tentative="1">
+      <w:start w:val="1"/>
+      <w:numFmt w:val="decimal"/>
+      <w:lvlText w:val="%4."/>
+      <w:lvlJc w:val="left"/>
+      <w:pPr>
+        <w:tabs>
+          <w:tab w:val="num" w:pos="2880"/>
+        </w:tabs>
+        <w:ind w:left="2880" w:hanging="360"/>
+      </w:pPr>
+    </w:lvl>
+    <w:lvl w:ilvl="4" w:tplc="370C178C" w:tentative="1">
+      <w:start w:val="1"/>
+      <w:numFmt w:val="decimal"/>
+      <w:lvlText w:val="%5."/>
+      <w:lvlJc w:val="left"/>
+      <w:pPr>
+        <w:tabs>
+          <w:tab w:val="num" w:pos="3600"/>
+        </w:tabs>
+        <w:ind w:left="3600" w:hanging="360"/>
+      </w:pPr>
+    </w:lvl>
+    <w:lvl w:ilvl="5" w:tplc="D478830C" w:tentative="1">
+      <w:start w:val="1"/>
+      <w:numFmt w:val="decimal"/>
+      <w:lvlText w:val="%6."/>
+      <w:lvlJc w:val="left"/>
+      <w:pPr>
+        <w:tabs>
+          <w:tab w:val="num" w:pos="4320"/>
+        </w:tabs>
+        <w:ind w:left="4320" w:hanging="360"/>
+      </w:pPr>
+    </w:lvl>
+    <w:lvl w:ilvl="6" w:tplc="F2763AD6" w:tentative="1">
+      <w:start w:val="1"/>
+      <w:numFmt w:val="decimal"/>
+      <w:lvlText w:val="%7."/>
+      <w:lvlJc w:val="left"/>
+      <w:pPr>
+        <w:tabs>
+          <w:tab w:val="num" w:pos="5040"/>
+        </w:tabs>
+        <w:ind w:left="5040" w:hanging="360"/>
+      </w:pPr>
+    </w:lvl>
+    <w:lvl w:ilvl="7" w:tplc="8B862DC8" w:tentative="1">
+      <w:start w:val="1"/>
+      <w:numFmt w:val="decimal"/>
+      <w:lvlText w:val="%8."/>
+      <w:lvlJc w:val="left"/>
+      <w:pPr>
+        <w:tabs>
+          <w:tab w:val="num" w:pos="5760"/>
+        </w:tabs>
+        <w:ind w:left="5760" w:hanging="360"/>
+      </w:pPr>
+    </w:lvl>
+    <w:lvl w:ilvl="8" w:tplc="9BA0F632" w:tentative="1">
+      <w:start w:val="1"/>
+      <w:numFmt w:val="decimal"/>
+      <w:lvlText w:val="%9."/>
+      <w:lvlJc w:val="left"/>
+      <w:pPr>
+        <w:tabs>
+          <w:tab w:val="num" w:pos="6480"/>
+        </w:tabs>
+        <w:ind w:left="6480" w:hanging="360"/>
+      </w:pPr>
+    </w:lvl>
+  </w:abstractNum>
+  <w:abstractNum w:abstractNumId="28" w15:restartNumberingAfterBreak="0">
     <w:nsid w:val="7F150CD4"/>
     <w:multiLevelType w:val="multilevel"/>
     <w:tmpl w:val="BA803898"/>
@@ -3340,19 +4830,78 @@
     <w:abstractNumId w:val="0"/>
   </w:num>
   <w:num w:numId="10" w16cid:durableId="2014143020">
+    <w:abstractNumId w:val="10"/>
+  </w:num>
+  <w:num w:numId="11" w16cid:durableId="817115237">
+    <w:abstractNumId w:val="19"/>
+  </w:num>
+  <w:num w:numId="12" w16cid:durableId="2062822756">
+    <w:abstractNumId w:val="18"/>
+  </w:num>
+  <w:num w:numId="13" w16cid:durableId="907570736">
+    <w:abstractNumId w:val="28"/>
+  </w:num>
+  <w:num w:numId="14" w16cid:durableId="1921017818">
+    <w:abstractNumId w:val="25"/>
+  </w:num>
+  <w:num w:numId="15" w16cid:durableId="2069104400">
+    <w:abstractNumId w:val="21"/>
+  </w:num>
+  <w:num w:numId="16" w16cid:durableId="325479819">
+    <w:abstractNumId w:val="12"/>
+    <w:lvlOverride w:ilvl="0">
+      <w:lvl w:ilvl="0">
+        <w:numFmt w:val="upperLetter"/>
+        <w:lvlText w:val="%1."/>
+        <w:lvlJc w:val="left"/>
+      </w:lvl>
+    </w:lvlOverride>
+  </w:num>
+  <w:num w:numId="17" w16cid:durableId="1555190918">
+    <w:abstractNumId w:val="13"/>
+  </w:num>
+  <w:num w:numId="18" w16cid:durableId="348798357">
+    <w:abstractNumId w:val="11"/>
+  </w:num>
+  <w:num w:numId="19" w16cid:durableId="647368384">
+    <w:abstractNumId w:val="24"/>
+  </w:num>
+  <w:num w:numId="20" w16cid:durableId="1079596678">
+    <w:abstractNumId w:val="17"/>
+  </w:num>
+  <w:num w:numId="21" w16cid:durableId="1102383498">
+    <w:abstractNumId w:val="26"/>
+  </w:num>
+  <w:num w:numId="22" w16cid:durableId="1652175640">
+    <w:abstractNumId w:val="14"/>
+    <w:lvlOverride w:ilvl="0">
+      <w:lvl w:ilvl="0">
+        <w:numFmt w:val="upperLetter"/>
+        <w:lvlText w:val="%1."/>
+        <w:lvlJc w:val="left"/>
+      </w:lvl>
+    </w:lvlOverride>
+  </w:num>
+  <w:num w:numId="23" w16cid:durableId="512451343">
+    <w:abstractNumId w:val="22"/>
+  </w:num>
+  <w:num w:numId="24" w16cid:durableId="199829192">
+    <w:abstractNumId w:val="23"/>
+  </w:num>
+  <w:num w:numId="25" w16cid:durableId="784160532">
+    <w:abstractNumId w:val="27"/>
+  </w:num>
+  <w:num w:numId="26" w16cid:durableId="1981761052">
+    <w:abstractNumId w:val="20"/>
+  </w:num>
+  <w:num w:numId="27" w16cid:durableId="585578470">
+    <w:abstractNumId w:val="16"/>
+  </w:num>
+  <w:num w:numId="28" w16cid:durableId="631332099">
     <w:abstractNumId w:val="9"/>
   </w:num>
-  <w:num w:numId="11" w16cid:durableId="817115237">
-    <w:abstractNumId w:val="11"/>
-  </w:num>
-  <w:num w:numId="12" w16cid:durableId="2062822756">
-    <w:abstractNumId w:val="10"/>
-  </w:num>
-  <w:num w:numId="13" w16cid:durableId="907570736">
-    <w:abstractNumId w:val="13"/>
-  </w:num>
-  <w:num w:numId="14" w16cid:durableId="1921017818">
-    <w:abstractNumId w:val="12"/>
+  <w:num w:numId="29" w16cid:durableId="1086730224">
+    <w:abstractNumId w:val="15"/>
   </w:num>
 </w:numbering>
 </file>
@@ -14739,12 +16288,25 @@
       </w:tcPr>
     </w:tblStylePr>
   </w:style>
+  <w:style w:type="paragraph" w:styleId="NormalWeb">
+    <w:name w:val="Normal (Web)"/>
+    <w:basedOn w:val="Normal"/>
+    <w:uiPriority w:val="99"/>
+    <w:semiHidden/>
+    <w:unhideWhenUsed/>
+    <w:rsid w:val="00BB7CCC"/>
+    <w:rPr>
+      <w:rFonts w:ascii="Times New Roman" w:hAnsi="Times New Roman" w:cs="Times New Roman"/>
+      <w:sz w:val="24"/>
+      <w:szCs w:val="24"/>
+    </w:rPr>
+  </w:style>
   <w:style w:type="character" w:styleId="Hyperlink">
     <w:name w:val="Hyperlink"/>
     <w:basedOn w:val="DefaultParagraphFont"/>
     <w:uiPriority w:val="99"/>
     <w:unhideWhenUsed/>
-    <w:rsid w:val="005E42EB"/>
+    <w:rsid w:val="00BB7CCC"/>
     <w:rPr>
       <w:color w:val="0000FF" w:themeColor="hyperlink"/>
       <w:u w:val="single"/>
@@ -14756,7 +16318,7 @@
     <w:uiPriority w:val="99"/>
     <w:semiHidden/>
     <w:unhideWhenUsed/>
-    <w:rsid w:val="005E42EB"/>
+    <w:rsid w:val="00BB7CCC"/>
     <w:rPr>
       <w:color w:val="605E5C"/>
       <w:shd w:val="clear" w:color="auto" w:fill="E1DFDD"/>

</xml_diff>